<commit_message>
SCRUM-56: TCs_Decision + update cac file
</commit_message>
<xml_diff>
--- a/Docs/QA-Testing/TEST PLAN.docx
+++ b/Docs/QA-Testing/TEST PLAN.docx
@@ -5079,19 +5079,7 @@
         <w:rPr>
           <w:szCs w:val="26"/>
         </w:rPr>
-        <w:t>3.</w:t>
-      </w:r>
-      <w:r>
-        <w:rPr>
-          <w:szCs w:val="26"/>
-        </w:rPr>
-        <w:t>6</w:t>
-      </w:r>
-      <w:r>
-        <w:rPr>
-          <w:szCs w:val="26"/>
-        </w:rPr>
-        <w:t xml:space="preserve"> </w:t>
+        <w:t xml:space="preserve">3.6 </w:t>
       </w:r>
       <w:r>
         <w:rPr>
@@ -5786,7 +5774,39 @@
           <w:sz w:val="26"/>
           <w:szCs w:val="26"/>
         </w:rPr>
-        <w:t xml:space="preserve">. Dự án chia làm 4 giai đoạn chính (1 Sprint 0 chuẩn bị, 3 Sprint thực thi và 1 Tuần dự phòng). </w:t>
+        <w:t xml:space="preserve">. Dự án chia làm </w:t>
+      </w:r>
+      <w:r>
+        <w:rPr>
+          <w:rFonts w:ascii="Times New Roman" w:eastAsia="Times New Roman" w:hAnsi="Times New Roman" w:cs="Times New Roman"/>
+          <w:sz w:val="26"/>
+          <w:szCs w:val="26"/>
+        </w:rPr>
+        <w:t>5</w:t>
+      </w:r>
+      <w:r>
+        <w:rPr>
+          <w:rFonts w:ascii="Times New Roman" w:eastAsia="Times New Roman" w:hAnsi="Times New Roman" w:cs="Times New Roman"/>
+          <w:sz w:val="26"/>
+          <w:szCs w:val="26"/>
+        </w:rPr>
+        <w:t xml:space="preserve"> giai đoạn chính (1 Sprint 0 chuẩn bị, </w:t>
+      </w:r>
+      <w:r>
+        <w:rPr>
+          <w:rFonts w:ascii="Times New Roman" w:eastAsia="Times New Roman" w:hAnsi="Times New Roman" w:cs="Times New Roman"/>
+          <w:sz w:val="26"/>
+          <w:szCs w:val="26"/>
+        </w:rPr>
+        <w:t>4</w:t>
+      </w:r>
+      <w:r>
+        <w:rPr>
+          <w:rFonts w:ascii="Times New Roman" w:eastAsia="Times New Roman" w:hAnsi="Times New Roman" w:cs="Times New Roman"/>
+          <w:sz w:val="26"/>
+          <w:szCs w:val="26"/>
+        </w:rPr>
+        <w:t xml:space="preserve"> Sprint thực thi và 1 Tuần dự phòng). </w:t>
       </w:r>
     </w:p>
     <w:p>
@@ -5830,7 +5850,15 @@
           <w:sz w:val="26"/>
           <w:szCs w:val="26"/>
         </w:rPr>
-        <w:t>Giai đoạn khẩn cấp chuẩn bị nền tảng công cụ và API trước khi bước vào 3 tuần kiểm thử chính thức. Các hạng mục sau đã hoàn tất 100%:</w:t>
+        <w:t xml:space="preserve">Đã </w:t>
+      </w:r>
+      <w:r>
+        <w:rPr>
+          <w:rFonts w:ascii="Times New Roman" w:hAnsi="Times New Roman" w:cs="Times New Roman"/>
+          <w:sz w:val="26"/>
+          <w:szCs w:val="26"/>
+        </w:rPr>
+        <w:t>hoàn tất 100%:</w:t>
       </w:r>
     </w:p>
     <w:p>
@@ -5924,8 +5952,6 @@
         </w:rPr>
       </w:pPr>
       <w:bookmarkStart w:id="19" w:name="_Toc238059525"/>
-      <w:bookmarkStart w:id="20" w:name="_GoBack"/>
-      <w:bookmarkEnd w:id="20"/>
       <w:r>
         <w:rPr>
           <w:szCs w:val="26"/>
@@ -5953,14 +5979,14 @@
         <w:tblLook w:val="04A0" w:firstRow="1" w:lastRow="0" w:firstColumn="1" w:lastColumn="0" w:noHBand="0" w:noVBand="1"/>
       </w:tblPr>
       <w:tblGrid>
-        <w:gridCol w:w="1555"/>
-        <w:gridCol w:w="4394"/>
-        <w:gridCol w:w="3401"/>
+        <w:gridCol w:w="1513"/>
+        <w:gridCol w:w="4152"/>
+        <w:gridCol w:w="3685"/>
       </w:tblGrid>
       <w:tr>
         <w:tc>
           <w:tcPr>
-            <w:tcW w:w="1555" w:type="dxa"/>
+            <w:tcW w:w="1513" w:type="dxa"/>
             <w:vAlign w:val="center"/>
           </w:tcPr>
           <w:p>
@@ -5984,7 +6010,7 @@
         </w:tc>
         <w:tc>
           <w:tcPr>
-            <w:tcW w:w="4394" w:type="dxa"/>
+            <w:tcW w:w="4152" w:type="dxa"/>
             <w:vAlign w:val="center"/>
           </w:tcPr>
           <w:p>
@@ -6008,7 +6034,7 @@
         </w:tc>
         <w:tc>
           <w:tcPr>
-            <w:tcW w:w="3401" w:type="dxa"/>
+            <w:tcW w:w="3685" w:type="dxa"/>
             <w:vAlign w:val="center"/>
           </w:tcPr>
           <w:p>
@@ -6034,7 +6060,7 @@
       <w:tr>
         <w:tc>
           <w:tcPr>
-            <w:tcW w:w="1555" w:type="dxa"/>
+            <w:tcW w:w="1513" w:type="dxa"/>
             <w:vAlign w:val="center"/>
           </w:tcPr>
           <w:p>
@@ -6058,7 +6084,7 @@
         </w:tc>
         <w:tc>
           <w:tcPr>
-            <w:tcW w:w="4394" w:type="dxa"/>
+            <w:tcW w:w="4152" w:type="dxa"/>
             <w:vAlign w:val="center"/>
           </w:tcPr>
           <w:p>
@@ -6136,7 +6162,7 @@
         </w:tc>
         <w:tc>
           <w:tcPr>
-            <w:tcW w:w="3401" w:type="dxa"/>
+            <w:tcW w:w="3685" w:type="dxa"/>
             <w:vAlign w:val="center"/>
           </w:tcPr>
           <w:p>
@@ -6216,7 +6242,7 @@
       <w:tr>
         <w:tc>
           <w:tcPr>
-            <w:tcW w:w="1555" w:type="dxa"/>
+            <w:tcW w:w="1513" w:type="dxa"/>
             <w:vAlign w:val="center"/>
           </w:tcPr>
           <w:p>
@@ -6240,7 +6266,7 @@
         </w:tc>
         <w:tc>
           <w:tcPr>
-            <w:tcW w:w="4394" w:type="dxa"/>
+            <w:tcW w:w="4152" w:type="dxa"/>
             <w:vAlign w:val="center"/>
           </w:tcPr>
           <w:p>
@@ -6334,10 +6360,64 @@
               <w:t>- Cập nhật RTM.xlsx, ánh xạ 100% Requirement ID ↔ Test Case ID.</w:t>
             </w:r>
           </w:p>
-        </w:tc>
-        <w:tc>
-          <w:tcPr>
-            <w:tcW w:w="3401" w:type="dxa"/>
+          <w:p>
+            <w:pPr>
+              <w:spacing w:after="0" w:line="240" w:lineRule="auto"/>
+              <w:rPr>
+                <w:rFonts w:ascii="Times New Roman" w:hAnsi="Times New Roman" w:cs="Times New Roman"/>
+                <w:sz w:val="26"/>
+                <w:szCs w:val="26"/>
+              </w:rPr>
+            </w:pPr>
+            <w:r>
+              <w:rPr>
+                <w:rFonts w:ascii="Times New Roman" w:hAnsi="Times New Roman" w:cs="Times New Roman"/>
+                <w:sz w:val="26"/>
+                <w:szCs w:val="26"/>
+              </w:rPr>
+              <w:t>- Áp dụng White-box Testing (JaCoCo + đo % coverage).</w:t>
+            </w:r>
+          </w:p>
+          <w:p>
+            <w:pPr>
+              <w:spacing w:after="0" w:line="240" w:lineRule="auto"/>
+              <w:rPr>
+                <w:rFonts w:ascii="Times New Roman" w:hAnsi="Times New Roman" w:cs="Times New Roman"/>
+                <w:sz w:val="26"/>
+                <w:szCs w:val="26"/>
+              </w:rPr>
+            </w:pPr>
+            <w:r>
+              <w:rPr>
+                <w:rFonts w:ascii="Times New Roman" w:hAnsi="Times New Roman" w:cs="Times New Roman"/>
+                <w:sz w:val="26"/>
+                <w:szCs w:val="26"/>
+              </w:rPr>
+              <w:t>- Áp dụng State Transition Testing (Order + Cart).</w:t>
+            </w:r>
+          </w:p>
+          <w:p>
+            <w:pPr>
+              <w:spacing w:after="0" w:line="240" w:lineRule="auto"/>
+              <w:rPr>
+                <w:rFonts w:ascii="Times New Roman" w:hAnsi="Times New Roman" w:cs="Times New Roman"/>
+                <w:sz w:val="26"/>
+                <w:szCs w:val="26"/>
+              </w:rPr>
+            </w:pPr>
+            <w:r>
+              <w:rPr>
+                <w:rFonts w:ascii="Times New Roman" w:hAnsi="Times New Roman" w:cs="Times New Roman"/>
+                <w:sz w:val="26"/>
+                <w:szCs w:val="26"/>
+              </w:rPr>
+              <w:t>- Áp dụng Decision Table Testing (ma trận phân quyền).</w:t>
+            </w:r>
+          </w:p>
+        </w:tc>
+        <w:tc>
+          <w:tcPr>
+            <w:tcW w:w="3685" w:type="dxa"/>
             <w:vAlign w:val="center"/>
           </w:tcPr>
           <w:p>
@@ -6356,43 +6436,25 @@
                 <w:szCs w:val="26"/>
               </w:rPr>
               <w:lastRenderedPageBreak/>
-              <w:t>- Test_Execution_Report.xlsx</w:t>
-            </w:r>
-          </w:p>
-          <w:p>
-            <w:pPr>
-              <w:spacing w:after="0" w:line="240" w:lineRule="auto"/>
-              <w:rPr>
-                <w:rFonts w:ascii="Times New Roman" w:hAnsi="Times New Roman" w:cs="Times New Roman"/>
-                <w:sz w:val="26"/>
-                <w:szCs w:val="26"/>
-              </w:rPr>
-            </w:pPr>
-            <w:r>
-              <w:rPr>
-                <w:rFonts w:ascii="Times New Roman" w:hAnsi="Times New Roman" w:cs="Times New Roman"/>
-                <w:sz w:val="26"/>
-                <w:szCs w:val="26"/>
-              </w:rPr>
-              <w:t>- 8+ Bug Tickets chuẩn trên Jira</w:t>
-            </w:r>
-          </w:p>
-          <w:p>
-            <w:pPr>
-              <w:spacing w:after="0" w:line="240" w:lineRule="auto"/>
-              <w:rPr>
-                <w:rFonts w:ascii="Times New Roman" w:hAnsi="Times New Roman" w:cs="Times New Roman"/>
-                <w:sz w:val="26"/>
-                <w:szCs w:val="26"/>
-              </w:rPr>
-            </w:pPr>
-            <w:r>
-              <w:rPr>
-                <w:rFonts w:ascii="Times New Roman" w:hAnsi="Times New Roman" w:cs="Times New Roman"/>
-                <w:sz w:val="26"/>
-                <w:szCs w:val="26"/>
-              </w:rPr>
-              <w:t>- 5 Script CodeceptJS (E2E) + Postman Collection (đã có BVA)</w:t>
+              <w:t>- Test_Case_Report_FE.xlsx + Test_Case_Report_API.xlsx</w:t>
+            </w:r>
+          </w:p>
+          <w:p>
+            <w:pPr>
+              <w:spacing w:after="0" w:line="240" w:lineRule="auto"/>
+              <w:rPr>
+                <w:rFonts w:ascii="Times New Roman" w:hAnsi="Times New Roman" w:cs="Times New Roman"/>
+                <w:sz w:val="26"/>
+                <w:szCs w:val="26"/>
+              </w:rPr>
+            </w:pPr>
+            <w:r>
+              <w:rPr>
+                <w:rFonts w:ascii="Times New Roman" w:hAnsi="Times New Roman" w:cs="Times New Roman"/>
+                <w:sz w:val="26"/>
+                <w:szCs w:val="26"/>
+              </w:rPr>
+              <w:t>- Bug_Report.xlsx + Bug Tickets trên Jira</w:t>
             </w:r>
           </w:p>
           <w:p>
@@ -6428,7 +6490,72 @@
                 <w:sz w:val="26"/>
                 <w:szCs w:val="26"/>
               </w:rPr>
-              <w:t>- Unit test pass CI/CD</w:t>
+              <w:t>- Test_Case_WhiteBox.xlsx + Coverage_Report</w:t>
+            </w:r>
+          </w:p>
+          <w:p>
+            <w:pPr>
+              <w:spacing w:after="0" w:line="240" w:lineRule="auto"/>
+              <w:rPr>
+                <w:rFonts w:ascii="Times New Roman" w:hAnsi="Times New Roman" w:cs="Times New Roman"/>
+                <w:sz w:val="26"/>
+                <w:szCs w:val="26"/>
+              </w:rPr>
+            </w:pPr>
+            <w:r>
+              <w:rPr>
+                <w:rFonts w:ascii="Times New Roman" w:hAnsi="Times New Roman" w:cs="Times New Roman"/>
+                <w:sz w:val="26"/>
+                <w:szCs w:val="26"/>
+              </w:rPr>
+              <w:t>- Test_Case_StateTransition.xlsx + sơ đồ</w:t>
+            </w:r>
+          </w:p>
+          <w:p>
+            <w:pPr>
+              <w:spacing w:after="0" w:line="240" w:lineRule="auto"/>
+              <w:rPr>
+                <w:rFonts w:ascii="Times New Roman" w:hAnsi="Times New Roman" w:cs="Times New Roman"/>
+                <w:sz w:val="26"/>
+                <w:szCs w:val="26"/>
+              </w:rPr>
+            </w:pPr>
+            <w:r>
+              <w:rPr>
+                <w:rFonts w:ascii="Times New Roman" w:hAnsi="Times New Roman" w:cs="Times New Roman"/>
+                <w:sz w:val="26"/>
+                <w:szCs w:val="26"/>
+              </w:rPr>
+              <w:t>- Test_Ca</w:t>
+            </w:r>
+            <w:bookmarkStart w:id="20" w:name="_GoBack"/>
+            <w:bookmarkEnd w:id="20"/>
+            <w:r>
+              <w:rPr>
+                <w:rFonts w:ascii="Times New Roman" w:hAnsi="Times New Roman" w:cs="Times New Roman"/>
+                <w:sz w:val="26"/>
+                <w:szCs w:val="26"/>
+              </w:rPr>
+              <w:t>se_DecisionTable.xlsx</w:t>
+            </w:r>
+          </w:p>
+          <w:p>
+            <w:pPr>
+              <w:spacing w:after="0" w:line="240" w:lineRule="auto"/>
+              <w:rPr>
+                <w:rFonts w:ascii="Times New Roman" w:hAnsi="Times New Roman" w:cs="Times New Roman"/>
+                <w:sz w:val="26"/>
+                <w:szCs w:val="26"/>
+              </w:rPr>
+            </w:pPr>
+            <w:r>
+              <w:rPr>
+                <w:rFonts w:ascii="Times New Roman" w:hAnsi="Times New Roman" w:cs="Times New Roman"/>
+                <w:sz w:val="26"/>
+                <w:szCs w:val="26"/>
+              </w:rPr>
+              <w:lastRenderedPageBreak/>
+              <w:t>- Unit Test pass CI/CD</w:t>
             </w:r>
           </w:p>
         </w:tc>
@@ -6436,31 +6563,32 @@
       <w:tr>
         <w:tc>
           <w:tcPr>
-            <w:tcW w:w="1555" w:type="dxa"/>
-            <w:vAlign w:val="center"/>
-          </w:tcPr>
-          <w:p>
-            <w:pPr>
-              <w:spacing w:after="0" w:line="240" w:lineRule="auto"/>
-              <w:rPr>
-                <w:rFonts w:ascii="Times New Roman" w:hAnsi="Times New Roman" w:cs="Times New Roman"/>
-                <w:sz w:val="26"/>
-                <w:szCs w:val="26"/>
-              </w:rPr>
-            </w:pPr>
-            <w:r>
-              <w:rPr>
-                <w:rFonts w:ascii="Times New Roman" w:hAnsi="Times New Roman" w:cs="Times New Roman"/>
-                <w:sz w:val="26"/>
-                <w:szCs w:val="26"/>
-              </w:rPr>
+            <w:tcW w:w="1513" w:type="dxa"/>
+            <w:vAlign w:val="center"/>
+          </w:tcPr>
+          <w:p>
+            <w:pPr>
+              <w:spacing w:after="0" w:line="240" w:lineRule="auto"/>
+              <w:rPr>
+                <w:rFonts w:ascii="Times New Roman" w:hAnsi="Times New Roman" w:cs="Times New Roman"/>
+                <w:sz w:val="26"/>
+                <w:szCs w:val="26"/>
+              </w:rPr>
+            </w:pPr>
+            <w:r>
+              <w:rPr>
+                <w:rFonts w:ascii="Times New Roman" w:hAnsi="Times New Roman" w:cs="Times New Roman"/>
+                <w:sz w:val="26"/>
+                <w:szCs w:val="26"/>
+              </w:rPr>
+              <w:lastRenderedPageBreak/>
               <w:t>Fix Bug</w:t>
             </w:r>
           </w:p>
         </w:tc>
         <w:tc>
           <w:tcPr>
-            <w:tcW w:w="4394" w:type="dxa"/>
+            <w:tcW w:w="4152" w:type="dxa"/>
             <w:vAlign w:val="center"/>
           </w:tcPr>
           <w:p>
@@ -6552,7 +6680,7 @@
         </w:tc>
         <w:tc>
           <w:tcPr>
-            <w:tcW w:w="3401" w:type="dxa"/>
+            <w:tcW w:w="3685" w:type="dxa"/>
             <w:vAlign w:val="center"/>
           </w:tcPr>
           <w:p>
@@ -6596,7 +6724,7 @@
       <w:tr>
         <w:tc>
           <w:tcPr>
-            <w:tcW w:w="1555" w:type="dxa"/>
+            <w:tcW w:w="1513" w:type="dxa"/>
             <w:vAlign w:val="center"/>
           </w:tcPr>
           <w:p>
@@ -6620,7 +6748,7 @@
         </w:tc>
         <w:tc>
           <w:tcPr>
-            <w:tcW w:w="4394" w:type="dxa"/>
+            <w:tcW w:w="4152" w:type="dxa"/>
             <w:vAlign w:val="center"/>
           </w:tcPr>
           <w:p>
@@ -6730,7 +6858,7 @@
         </w:tc>
         <w:tc>
           <w:tcPr>
-            <w:tcW w:w="3401" w:type="dxa"/>
+            <w:tcW w:w="3685" w:type="dxa"/>
             <w:vAlign w:val="center"/>
           </w:tcPr>
           <w:p>
@@ -6959,6 +7087,7 @@
           <w:sz w:val="26"/>
           <w:szCs w:val="26"/>
         </w:rPr>
+        <w:lastRenderedPageBreak/>
         <w:t xml:space="preserve">Ghi nhận (Log Bug): Tạo Bug Ticket trên Jira / điền vào Bug_Report.xlsx kèm đầy đủ ảnh chụp, Response Body và đề xuất hướng xử lý. </w:t>
       </w:r>
     </w:p>
@@ -7003,7 +7132,6 @@
         <w:rPr>
           <w:szCs w:val="26"/>
         </w:rPr>
-        <w:lastRenderedPageBreak/>
         <w:t>7.1 Phân loại độ nghiêm trọng của lỗi (Severity Levels)</w:t>
       </w:r>
       <w:bookmarkEnd w:id="23"/>
@@ -8363,6 +8491,7 @@
   <w:style w:type="character" w:default="1" w:styleId="DefaultParagraphFont">
     <w:name w:val="Default Paragraph Font"/>
     <w:uiPriority w:val="1"/>
+    <w:semiHidden/>
     <w:unhideWhenUsed/>
   </w:style>
   <w:style w:type="table" w:default="1" w:styleId="TableNormal">
@@ -8956,7 +9085,7 @@
 </file>
 
 <file path=customXml/itemProps1.xml><?xml version="1.0" encoding="utf-8"?>
-<ds:datastoreItem xmlns:ds="http://schemas.openxmlformats.org/officeDocument/2006/customXml" ds:itemID="{716F5DFF-6AA9-4714-BE4C-51B073ABB17F}">
+<ds:datastoreItem xmlns:ds="http://schemas.openxmlformats.org/officeDocument/2006/customXml" ds:itemID="{AAF29482-15A1-4BE6-8940-60C9481E8B35}">
   <ds:schemaRefs>
     <ds:schemaRef ds:uri="http://schemas.openxmlformats.org/officeDocument/2006/bibliography"/>
   </ds:schemaRefs>

</xml_diff>

<commit_message>
restore: bring all files from master (zip backup)
</commit_message>
<xml_diff>
--- a/Docs/QA-Testing/TEST PLAN.docx
+++ b/Docs/QA-Testing/TEST PLAN.docx
@@ -174,110 +174,63 @@
             </w:rPr>
             <w:fldChar w:fldCharType="separate"/>
           </w:r>
-          <w:bookmarkStart w:id="0" w:name="_GoBack"/>
-          <w:bookmarkEnd w:id="0"/>
-          <w:r>
-            <w:rPr>
-              <w:rStyle w:val="Hyperlink"/>
-              <w:noProof/>
-            </w:rPr>
-            <w:fldChar w:fldCharType="begin"/>
-          </w:r>
-          <w:r>
-            <w:rPr>
-              <w:rStyle w:val="Hyperlink"/>
-              <w:noProof/>
-            </w:rPr>
-            <w:instrText xml:space="preserve"> </w:instrText>
-          </w:r>
-          <w:r>
-            <w:rPr>
-              <w:noProof/>
-            </w:rPr>
-            <w:instrText>HYPERLINK \l "_Toc237628322"</w:instrText>
-          </w:r>
-          <w:r>
-            <w:rPr>
-              <w:rStyle w:val="Hyperlink"/>
-              <w:noProof/>
-            </w:rPr>
-            <w:instrText xml:space="preserve"> </w:instrText>
-          </w:r>
-          <w:r>
-            <w:rPr>
-              <w:rStyle w:val="Hyperlink"/>
-              <w:noProof/>
-            </w:rPr>
-          </w:r>
-          <w:r>
-            <w:rPr>
-              <w:rStyle w:val="Hyperlink"/>
-              <w:noProof/>
-            </w:rPr>
-            <w:fldChar w:fldCharType="separate"/>
-          </w:r>
-          <w:r>
-            <w:rPr>
-              <w:rStyle w:val="Hyperlink"/>
-              <w:noProof/>
-            </w:rPr>
-            <w:t>1. MỤC TIÊU (Objectives)</w:t>
-          </w:r>
-          <w:r>
-            <w:rPr>
-              <w:noProof/>
-              <w:webHidden/>
-            </w:rPr>
-            <w:tab/>
-          </w:r>
-          <w:r>
-            <w:rPr>
-              <w:noProof/>
-              <w:webHidden/>
-            </w:rPr>
-            <w:fldChar w:fldCharType="begin"/>
-          </w:r>
-          <w:r>
-            <w:rPr>
-              <w:noProof/>
-              <w:webHidden/>
-            </w:rPr>
-            <w:instrText xml:space="preserve"> PAGEREF _Toc237628322 \h </w:instrText>
-          </w:r>
-          <w:r>
-            <w:rPr>
-              <w:noProof/>
-              <w:webHidden/>
-            </w:rPr>
-          </w:r>
-          <w:r>
-            <w:rPr>
-              <w:noProof/>
-              <w:webHidden/>
-            </w:rPr>
-            <w:fldChar w:fldCharType="separate"/>
-          </w:r>
-          <w:r>
-            <w:rPr>
-              <w:noProof/>
-              <w:webHidden/>
-            </w:rPr>
-            <w:t>2</w:t>
-          </w:r>
-          <w:r>
-            <w:rPr>
-              <w:noProof/>
-              <w:webHidden/>
-            </w:rPr>
-            <w:fldChar w:fldCharType="end"/>
-          </w:r>
-          <w:r>
-            <w:rPr>
-              <w:rStyle w:val="Hyperlink"/>
-              <w:noProof/>
-            </w:rPr>
-            <w:fldChar w:fldCharType="end"/>
-          </w:r>
+          <w:hyperlink w:anchor="_Toc238059506" w:history="1">
+            <w:r>
+              <w:rPr>
+                <w:rStyle w:val="Hyperlink"/>
+                <w:noProof/>
+              </w:rPr>
+              <w:t>1. MỤC TIÊU (Objectives)</w:t>
+            </w:r>
+            <w:r>
+              <w:rPr>
+                <w:noProof/>
+                <w:webHidden/>
+              </w:rPr>
+              <w:tab/>
+            </w:r>
+            <w:r>
+              <w:rPr>
+                <w:noProof/>
+                <w:webHidden/>
+              </w:rPr>
+              <w:fldChar w:fldCharType="begin"/>
+            </w:r>
+            <w:r>
+              <w:rPr>
+                <w:noProof/>
+                <w:webHidden/>
+              </w:rPr>
+              <w:instrText xml:space="preserve"> PAGEREF _Toc238059506 \h </w:instrText>
+            </w:r>
+            <w:r>
+              <w:rPr>
+                <w:noProof/>
+                <w:webHidden/>
+              </w:rPr>
+            </w:r>
+            <w:r>
+              <w:rPr>
+                <w:noProof/>
+                <w:webHidden/>
+              </w:rPr>
+              <w:fldChar w:fldCharType="separate"/>
+            </w:r>
+            <w:r>
+              <w:rPr>
+                <w:noProof/>
+                <w:webHidden/>
+              </w:rPr>
+              <w:t>2</w:t>
+            </w:r>
+            <w:r>
+              <w:rPr>
+                <w:noProof/>
+                <w:webHidden/>
+              </w:rPr>
+              <w:fldChar w:fldCharType="end"/>
+            </w:r>
+          </w:hyperlink>
         </w:p>
         <w:p>
           <w:pPr>
@@ -290,7 +243,7 @@
               <w:noProof/>
             </w:rPr>
           </w:pPr>
-          <w:hyperlink w:anchor="_Toc237628323" w:history="1">
+          <w:hyperlink w:anchor="_Toc238059507" w:history="1">
             <w:r>
               <w:rPr>
                 <w:rStyle w:val="Hyperlink"/>
@@ -317,7 +270,7 @@
                 <w:noProof/>
                 <w:webHidden/>
               </w:rPr>
-              <w:instrText xml:space="preserve"> PAGEREF _Toc237628323 \h </w:instrText>
+              <w:instrText xml:space="preserve"> PAGEREF _Toc238059507 \h </w:instrText>
             </w:r>
             <w:r>
               <w:rPr>
@@ -359,7 +312,7 @@
               <w:noProof/>
             </w:rPr>
           </w:pPr>
-          <w:hyperlink w:anchor="_Toc237628324" w:history="1">
+          <w:hyperlink w:anchor="_Toc238059508" w:history="1">
             <w:r>
               <w:rPr>
                 <w:rStyle w:val="Hyperlink"/>
@@ -386,7 +339,7 @@
                 <w:noProof/>
                 <w:webHidden/>
               </w:rPr>
-              <w:instrText xml:space="preserve"> PAGEREF _Toc237628324 \h </w:instrText>
+              <w:instrText xml:space="preserve"> PAGEREF _Toc238059508 \h </w:instrText>
             </w:r>
             <w:r>
               <w:rPr>
@@ -428,7 +381,7 @@
               <w:noProof/>
             </w:rPr>
           </w:pPr>
-          <w:hyperlink w:anchor="_Toc237628325" w:history="1">
+          <w:hyperlink w:anchor="_Toc238059509" w:history="1">
             <w:r>
               <w:rPr>
                 <w:rStyle w:val="Hyperlink"/>
@@ -455,7 +408,7 @@
                 <w:noProof/>
                 <w:webHidden/>
               </w:rPr>
-              <w:instrText xml:space="preserve"> PAGEREF _Toc237628325 \h </w:instrText>
+              <w:instrText xml:space="preserve"> PAGEREF _Toc238059509 \h </w:instrText>
             </w:r>
             <w:r>
               <w:rPr>
@@ -497,7 +450,7 @@
               <w:noProof/>
             </w:rPr>
           </w:pPr>
-          <w:hyperlink w:anchor="_Toc237628326" w:history="1">
+          <w:hyperlink w:anchor="_Toc238059510" w:history="1">
             <w:r>
               <w:rPr>
                 <w:rStyle w:val="Hyperlink"/>
@@ -524,7 +477,7 @@
                 <w:noProof/>
                 <w:webHidden/>
               </w:rPr>
-              <w:instrText xml:space="preserve"> PAGEREF _Toc237628326 \h </w:instrText>
+              <w:instrText xml:space="preserve"> PAGEREF _Toc238059510 \h </w:instrText>
             </w:r>
             <w:r>
               <w:rPr>
@@ -566,7 +519,7 @@
               <w:noProof/>
             </w:rPr>
           </w:pPr>
-          <w:hyperlink w:anchor="_Toc237628327" w:history="1">
+          <w:hyperlink w:anchor="_Toc238059511" w:history="1">
             <w:r>
               <w:rPr>
                 <w:rStyle w:val="Hyperlink"/>
@@ -593,7 +546,7 @@
                 <w:noProof/>
                 <w:webHidden/>
               </w:rPr>
-              <w:instrText xml:space="preserve"> PAGEREF _Toc237628327 \h </w:instrText>
+              <w:instrText xml:space="preserve"> PAGEREF _Toc238059511 \h </w:instrText>
             </w:r>
             <w:r>
               <w:rPr>
@@ -635,7 +588,7 @@
               <w:noProof/>
             </w:rPr>
           </w:pPr>
-          <w:hyperlink w:anchor="_Toc237628328" w:history="1">
+          <w:hyperlink w:anchor="_Toc238059512" w:history="1">
             <w:r>
               <w:rPr>
                 <w:rStyle w:val="Hyperlink"/>
@@ -662,7 +615,7 @@
                 <w:noProof/>
                 <w:webHidden/>
               </w:rPr>
-              <w:instrText xml:space="preserve"> PAGEREF _Toc237628328 \h </w:instrText>
+              <w:instrText xml:space="preserve"> PAGEREF _Toc238059512 \h </w:instrText>
             </w:r>
             <w:r>
               <w:rPr>
@@ -704,7 +657,7 @@
               <w:noProof/>
             </w:rPr>
           </w:pPr>
-          <w:hyperlink w:anchor="_Toc237628329" w:history="1">
+          <w:hyperlink w:anchor="_Toc238059513" w:history="1">
             <w:r>
               <w:rPr>
                 <w:rStyle w:val="Hyperlink"/>
@@ -731,7 +684,7 @@
                 <w:noProof/>
                 <w:webHidden/>
               </w:rPr>
-              <w:instrText xml:space="preserve"> PAGEREF _Toc237628329 \h </w:instrText>
+              <w:instrText xml:space="preserve"> PAGEREF _Toc238059513 \h </w:instrText>
             </w:r>
             <w:r>
               <w:rPr>
@@ -773,7 +726,7 @@
               <w:noProof/>
             </w:rPr>
           </w:pPr>
-          <w:hyperlink w:anchor="_Toc237628330" w:history="1">
+          <w:hyperlink w:anchor="_Toc238059514" w:history="1">
             <w:r>
               <w:rPr>
                 <w:rStyle w:val="Hyperlink"/>
@@ -800,7 +753,7 @@
                 <w:noProof/>
                 <w:webHidden/>
               </w:rPr>
-              <w:instrText xml:space="preserve"> PAGEREF _Toc237628330 \h </w:instrText>
+              <w:instrText xml:space="preserve"> PAGEREF _Toc238059514 \h </w:instrText>
             </w:r>
             <w:r>
               <w:rPr>
@@ -842,7 +795,7 @@
               <w:noProof/>
             </w:rPr>
           </w:pPr>
-          <w:hyperlink w:anchor="_Toc237628331" w:history="1">
+          <w:hyperlink w:anchor="_Toc238059515" w:history="1">
             <w:r>
               <w:rPr>
                 <w:rStyle w:val="Hyperlink"/>
@@ -884,7 +837,7 @@
                 <w:noProof/>
                 <w:webHidden/>
               </w:rPr>
-              <w:instrText xml:space="preserve"> PAGEREF _Toc237628331 \h </w:instrText>
+              <w:instrText xml:space="preserve"> PAGEREF _Toc238059515 \h </w:instrText>
             </w:r>
             <w:r>
               <w:rPr>
@@ -926,7 +879,7 @@
               <w:noProof/>
             </w:rPr>
           </w:pPr>
-          <w:hyperlink w:anchor="_Toc237628332" w:history="1">
+          <w:hyperlink w:anchor="_Toc238059516" w:history="1">
             <w:r>
               <w:rPr>
                 <w:rStyle w:val="Hyperlink"/>
@@ -953,7 +906,7 @@
                 <w:noProof/>
                 <w:webHidden/>
               </w:rPr>
-              <w:instrText xml:space="preserve"> PAGEREF _Toc237628332 \h </w:instrText>
+              <w:instrText xml:space="preserve"> PAGEREF _Toc238059516 \h </w:instrText>
             </w:r>
             <w:r>
               <w:rPr>
@@ -995,7 +948,7 @@
               <w:noProof/>
             </w:rPr>
           </w:pPr>
-          <w:hyperlink w:anchor="_Toc237628333" w:history="1">
+          <w:hyperlink w:anchor="_Toc238059517" w:history="1">
             <w:r>
               <w:rPr>
                 <w:rStyle w:val="Hyperlink"/>
@@ -1022,7 +975,7 @@
                 <w:noProof/>
                 <w:webHidden/>
               </w:rPr>
-              <w:instrText xml:space="preserve"> PAGEREF _Toc237628333 \h </w:instrText>
+              <w:instrText xml:space="preserve"> PAGEREF _Toc238059517 \h </w:instrText>
             </w:r>
             <w:r>
               <w:rPr>
@@ -1064,7 +1017,7 @@
               <w:noProof/>
             </w:rPr>
           </w:pPr>
-          <w:hyperlink w:anchor="_Toc237628334" w:history="1">
+          <w:hyperlink w:anchor="_Toc238059518" w:history="1">
             <w:r>
               <w:rPr>
                 <w:rStyle w:val="Hyperlink"/>
@@ -1091,7 +1044,7 @@
                 <w:noProof/>
                 <w:webHidden/>
               </w:rPr>
-              <w:instrText xml:space="preserve"> PAGEREF _Toc237628334 \h </w:instrText>
+              <w:instrText xml:space="preserve"> PAGEREF _Toc238059518 \h </w:instrText>
             </w:r>
             <w:r>
               <w:rPr>
@@ -1133,7 +1086,7 @@
               <w:noProof/>
             </w:rPr>
           </w:pPr>
-          <w:hyperlink w:anchor="_Toc237628335" w:history="1">
+          <w:hyperlink w:anchor="_Toc238059519" w:history="1">
             <w:r>
               <w:rPr>
                 <w:rStyle w:val="Hyperlink"/>
@@ -1160,7 +1113,7 @@
                 <w:noProof/>
                 <w:webHidden/>
               </w:rPr>
-              <w:instrText xml:space="preserve"> PAGEREF _Toc237628335 \h </w:instrText>
+              <w:instrText xml:space="preserve"> PAGEREF _Toc238059519 \h </w:instrText>
             </w:r>
             <w:r>
               <w:rPr>
@@ -1202,7 +1155,7 @@
               <w:noProof/>
             </w:rPr>
           </w:pPr>
-          <w:hyperlink w:anchor="_Toc237628336" w:history="1">
+          <w:hyperlink w:anchor="_Toc238059520" w:history="1">
             <w:r>
               <w:rPr>
                 <w:rStyle w:val="Hyperlink"/>
@@ -1229,7 +1182,7 @@
                 <w:noProof/>
                 <w:webHidden/>
               </w:rPr>
-              <w:instrText xml:space="preserve"> PAGEREF _Toc237628336 \h </w:instrText>
+              <w:instrText xml:space="preserve"> PAGEREF _Toc238059520 \h </w:instrText>
             </w:r>
             <w:r>
               <w:rPr>
@@ -1271,7 +1224,7 @@
               <w:noProof/>
             </w:rPr>
           </w:pPr>
-          <w:hyperlink w:anchor="_Toc237628337" w:history="1">
+          <w:hyperlink w:anchor="_Toc238059521" w:history="1">
             <w:r>
               <w:rPr>
                 <w:rStyle w:val="Hyperlink"/>
@@ -1298,7 +1251,7 @@
                 <w:noProof/>
                 <w:webHidden/>
               </w:rPr>
-              <w:instrText xml:space="preserve"> PAGEREF _Toc237628337 \h </w:instrText>
+              <w:instrText xml:space="preserve"> PAGEREF _Toc238059521 \h </w:instrText>
             </w:r>
             <w:r>
               <w:rPr>
@@ -1340,7 +1293,7 @@
               <w:noProof/>
             </w:rPr>
           </w:pPr>
-          <w:hyperlink w:anchor="_Toc237628338" w:history="1">
+          <w:hyperlink w:anchor="_Toc238059522" w:history="1">
             <w:r>
               <w:rPr>
                 <w:rStyle w:val="Hyperlink"/>
@@ -1367,7 +1320,7 @@
                 <w:noProof/>
                 <w:webHidden/>
               </w:rPr>
-              <w:instrText xml:space="preserve"> PAGEREF _Toc237628338 \h </w:instrText>
+              <w:instrText xml:space="preserve"> PAGEREF _Toc238059522 \h </w:instrText>
             </w:r>
             <w:r>
               <w:rPr>
@@ -1409,7 +1362,7 @@
               <w:noProof/>
             </w:rPr>
           </w:pPr>
-          <w:hyperlink w:anchor="_Toc237628339" w:history="1">
+          <w:hyperlink w:anchor="_Toc238059523" w:history="1">
             <w:r>
               <w:rPr>
                 <w:rStyle w:val="Hyperlink"/>
@@ -1436,7 +1389,7 @@
                 <w:noProof/>
                 <w:webHidden/>
               </w:rPr>
-              <w:instrText xml:space="preserve"> PAGEREF _Toc237628339 \h </w:instrText>
+              <w:instrText xml:space="preserve"> PAGEREF _Toc238059523 \h </w:instrText>
             </w:r>
             <w:r>
               <w:rPr>
@@ -1478,7 +1431,7 @@
               <w:noProof/>
             </w:rPr>
           </w:pPr>
-          <w:hyperlink w:anchor="_Toc237628340" w:history="1">
+          <w:hyperlink w:anchor="_Toc238059524" w:history="1">
             <w:r>
               <w:rPr>
                 <w:rStyle w:val="Hyperlink"/>
@@ -1505,7 +1458,7 @@
                 <w:noProof/>
                 <w:webHidden/>
               </w:rPr>
-              <w:instrText xml:space="preserve"> PAGEREF _Toc237628340 \h </w:instrText>
+              <w:instrText xml:space="preserve"> PAGEREF _Toc238059524 \h </w:instrText>
             </w:r>
             <w:r>
               <w:rPr>
@@ -1547,7 +1500,7 @@
               <w:noProof/>
             </w:rPr>
           </w:pPr>
-          <w:hyperlink w:anchor="_Toc237628341" w:history="1">
+          <w:hyperlink w:anchor="_Toc238059525" w:history="1">
             <w:r>
               <w:rPr>
                 <w:rStyle w:val="Hyperlink"/>
@@ -1574,7 +1527,7 @@
                 <w:noProof/>
                 <w:webHidden/>
               </w:rPr>
-              <w:instrText xml:space="preserve"> PAGEREF _Toc237628341 \h </w:instrText>
+              <w:instrText xml:space="preserve"> PAGEREF _Toc238059525 \h </w:instrText>
             </w:r>
             <w:r>
               <w:rPr>
@@ -1616,7 +1569,7 @@
               <w:noProof/>
             </w:rPr>
           </w:pPr>
-          <w:hyperlink w:anchor="_Toc237628342" w:history="1">
+          <w:hyperlink w:anchor="_Toc238059526" w:history="1">
             <w:r>
               <w:rPr>
                 <w:rStyle w:val="Hyperlink"/>
@@ -1643,7 +1596,7 @@
                 <w:noProof/>
                 <w:webHidden/>
               </w:rPr>
-              <w:instrText xml:space="preserve"> PAGEREF _Toc237628342 \h </w:instrText>
+              <w:instrText xml:space="preserve"> PAGEREF _Toc238059526 \h </w:instrText>
             </w:r>
             <w:r>
               <w:rPr>
@@ -1685,7 +1638,7 @@
               <w:noProof/>
             </w:rPr>
           </w:pPr>
-          <w:hyperlink w:anchor="_Toc237628343" w:history="1">
+          <w:hyperlink w:anchor="_Toc238059527" w:history="1">
             <w:r>
               <w:rPr>
                 <w:rStyle w:val="Hyperlink"/>
@@ -1712,7 +1665,7 @@
                 <w:noProof/>
                 <w:webHidden/>
               </w:rPr>
-              <w:instrText xml:space="preserve"> PAGEREF _Toc237628343 \h </w:instrText>
+              <w:instrText xml:space="preserve"> PAGEREF _Toc238059527 \h </w:instrText>
             </w:r>
             <w:r>
               <w:rPr>
@@ -1754,7 +1707,7 @@
               <w:noProof/>
             </w:rPr>
           </w:pPr>
-          <w:hyperlink w:anchor="_Toc237628344" w:history="1">
+          <w:hyperlink w:anchor="_Toc238059528" w:history="1">
             <w:r>
               <w:rPr>
                 <w:rStyle w:val="Hyperlink"/>
@@ -1781,7 +1734,7 @@
                 <w:noProof/>
                 <w:webHidden/>
               </w:rPr>
-              <w:instrText xml:space="preserve"> PAGEREF _Toc237628344 \h </w:instrText>
+              <w:instrText xml:space="preserve"> PAGEREF _Toc238059528 \h </w:instrText>
             </w:r>
             <w:r>
               <w:rPr>
@@ -1823,7 +1776,7 @@
               <w:noProof/>
             </w:rPr>
           </w:pPr>
-          <w:hyperlink w:anchor="_Toc237628345" w:history="1">
+          <w:hyperlink w:anchor="_Toc238059529" w:history="1">
             <w:r>
               <w:rPr>
                 <w:rStyle w:val="Hyperlink"/>
@@ -1850,7 +1803,7 @@
                 <w:noProof/>
                 <w:webHidden/>
               </w:rPr>
-              <w:instrText xml:space="preserve"> PAGEREF _Toc237628345 \h </w:instrText>
+              <w:instrText xml:space="preserve"> PAGEREF _Toc238059529 \h </w:instrText>
             </w:r>
             <w:r>
               <w:rPr>
@@ -2167,6 +2120,14 @@
                 <w:szCs w:val="26"/>
               </w:rPr>
             </w:pPr>
+            <w:r>
+              <w:rPr>
+                <w:rFonts w:ascii="Times New Roman" w:hAnsi="Times New Roman" w:cs="Times New Roman"/>
+                <w:sz w:val="26"/>
+                <w:szCs w:val="26"/>
+              </w:rPr>
+              <w:t>11/08/2026</w:t>
+            </w:r>
           </w:p>
         </w:tc>
         <w:tc>
@@ -2257,6 +2218,14 @@
                 <w:szCs w:val="26"/>
               </w:rPr>
             </w:pPr>
+            <w:r>
+              <w:rPr>
+                <w:rFonts w:ascii="Times New Roman" w:hAnsi="Times New Roman" w:cs="Times New Roman"/>
+                <w:sz w:val="26"/>
+                <w:szCs w:val="26"/>
+              </w:rPr>
+              <w:t>13/08/2026</w:t>
+            </w:r>
           </w:p>
         </w:tc>
         <w:tc>
@@ -2312,6 +2281,104 @@
                 <w:szCs w:val="26"/>
               </w:rPr>
               <w:t>ổ sung chiến lược CodeceptJS</w:t>
+            </w:r>
+          </w:p>
+        </w:tc>
+      </w:tr>
+      <w:tr>
+        <w:tc>
+          <w:tcPr>
+            <w:tcW w:w="1271" w:type="dxa"/>
+            <w:vAlign w:val="center"/>
+          </w:tcPr>
+          <w:p>
+            <w:pPr>
+              <w:spacing w:after="0" w:line="240" w:lineRule="auto"/>
+              <w:rPr>
+                <w:rFonts w:ascii="Times New Roman" w:hAnsi="Times New Roman" w:cs="Times New Roman"/>
+                <w:sz w:val="26"/>
+                <w:szCs w:val="26"/>
+              </w:rPr>
+            </w:pPr>
+            <w:r>
+              <w:rPr>
+                <w:rFonts w:ascii="Times New Roman" w:hAnsi="Times New Roman" w:cs="Times New Roman"/>
+                <w:sz w:val="26"/>
+                <w:szCs w:val="26"/>
+              </w:rPr>
+              <w:t>v1.3</w:t>
+            </w:r>
+          </w:p>
+        </w:tc>
+        <w:tc>
+          <w:tcPr>
+            <w:tcW w:w="1559" w:type="dxa"/>
+            <w:vAlign w:val="center"/>
+          </w:tcPr>
+          <w:p>
+            <w:pPr>
+              <w:spacing w:after="0" w:line="240" w:lineRule="auto"/>
+              <w:rPr>
+                <w:rFonts w:ascii="Times New Roman" w:hAnsi="Times New Roman" w:cs="Times New Roman"/>
+                <w:sz w:val="26"/>
+                <w:szCs w:val="26"/>
+              </w:rPr>
+            </w:pPr>
+            <w:r>
+              <w:rPr>
+                <w:rFonts w:ascii="Times New Roman" w:hAnsi="Times New Roman" w:cs="Times New Roman"/>
+                <w:sz w:val="26"/>
+                <w:szCs w:val="26"/>
+              </w:rPr>
+              <w:t>19/08/2026</w:t>
+            </w:r>
+          </w:p>
+        </w:tc>
+        <w:tc>
+          <w:tcPr>
+            <w:tcW w:w="2552" w:type="dxa"/>
+            <w:vAlign w:val="center"/>
+          </w:tcPr>
+          <w:p>
+            <w:pPr>
+              <w:spacing w:after="0" w:line="240" w:lineRule="auto"/>
+              <w:rPr>
+                <w:rFonts w:ascii="Times New Roman" w:hAnsi="Times New Roman" w:cs="Times New Roman"/>
+                <w:sz w:val="26"/>
+                <w:szCs w:val="26"/>
+              </w:rPr>
+            </w:pPr>
+            <w:r>
+              <w:rPr>
+                <w:rFonts w:ascii="Times New Roman" w:hAnsi="Times New Roman" w:cs="Times New Roman"/>
+                <w:sz w:val="26"/>
+                <w:szCs w:val="26"/>
+              </w:rPr>
+              <w:t>Lê Hoàng Thanh</w:t>
+            </w:r>
+          </w:p>
+        </w:tc>
+        <w:tc>
+          <w:tcPr>
+            <w:tcW w:w="3968" w:type="dxa"/>
+            <w:vAlign w:val="center"/>
+          </w:tcPr>
+          <w:p>
+            <w:pPr>
+              <w:spacing w:after="0" w:line="240" w:lineRule="auto"/>
+              <w:rPr>
+                <w:rFonts w:ascii="Times New Roman" w:hAnsi="Times New Roman" w:cs="Times New Roman"/>
+                <w:sz w:val="26"/>
+                <w:szCs w:val="26"/>
+              </w:rPr>
+            </w:pPr>
+            <w:r>
+              <w:rPr>
+                <w:rFonts w:ascii="Times New Roman" w:hAnsi="Times New Roman" w:cs="Times New Roman"/>
+                <w:sz w:val="26"/>
+                <w:szCs w:val="26"/>
+              </w:rPr>
+              <w:t>Cập nhật nội dung mới</w:t>
             </w:r>
           </w:p>
         </w:tc>
@@ -2335,148 +2402,164 @@
           <w:szCs w:val="26"/>
         </w:rPr>
       </w:pPr>
-      <w:bookmarkStart w:id="1" w:name="_Toc237628322"/>
+      <w:bookmarkStart w:id="0" w:name="_Toc238059506"/>
       <w:r>
         <w:rPr>
           <w:szCs w:val="26"/>
         </w:rPr>
         <w:t>1. MỤC TIÊU (Objectives)</w:t>
       </w:r>
+      <w:bookmarkEnd w:id="0"/>
+    </w:p>
+    <w:p>
+      <w:pPr>
+        <w:jc w:val="both"/>
+        <w:rPr>
+          <w:rFonts w:ascii="Times New Roman" w:hAnsi="Times New Roman" w:cs="Times New Roman"/>
+          <w:sz w:val="26"/>
+          <w:szCs w:val="26"/>
+        </w:rPr>
+      </w:pPr>
+      <w:r>
+        <w:rPr>
+          <w:rFonts w:ascii="Times New Roman" w:hAnsi="Times New Roman" w:cs="Times New Roman"/>
+          <w:sz w:val="26"/>
+          <w:szCs w:val="26"/>
+        </w:rPr>
+        <w:t>Tài liệu Kế hoạch Kiểm thử (Test Plan) này nhằm mục đích:</w:t>
+      </w:r>
+    </w:p>
+    <w:p>
+      <w:pPr>
+        <w:jc w:val="both"/>
+        <w:rPr>
+          <w:rFonts w:ascii="Times New Roman" w:hAnsi="Times New Roman" w:cs="Times New Roman"/>
+          <w:sz w:val="26"/>
+          <w:szCs w:val="26"/>
+        </w:rPr>
+      </w:pPr>
+      <w:r>
+        <w:rPr>
+          <w:rFonts w:ascii="Times New Roman" w:hAnsi="Times New Roman" w:cs="Times New Roman"/>
+          <w:sz w:val="26"/>
+          <w:szCs w:val="26"/>
+        </w:rPr>
+        <w:t xml:space="preserve">+ Xác định rõ Phạm vi (In-Scope) và Ngoài phạm vi (Out-of-Scope) kiểm thử cho 3 tuần làm việc còn lại của đồ án môn Kiểm chứng Phần mềm. </w:t>
+      </w:r>
+    </w:p>
+    <w:p>
+      <w:pPr>
+        <w:jc w:val="both"/>
+        <w:rPr>
+          <w:rFonts w:ascii="Times New Roman" w:hAnsi="Times New Roman" w:cs="Times New Roman"/>
+          <w:sz w:val="26"/>
+          <w:szCs w:val="26"/>
+        </w:rPr>
+      </w:pPr>
+      <w:r>
+        <w:rPr>
+          <w:rFonts w:ascii="Times New Roman" w:hAnsi="Times New Roman" w:cs="Times New Roman"/>
+          <w:sz w:val="26"/>
+          <w:szCs w:val="26"/>
+        </w:rPr>
+        <w:t xml:space="preserve">+ Thống nhất Chiến lược kiểm thử (Test Strategy) kết hợp giữa Manual Testing (Giao diện FE), API Automation Testing (Postman/Newman) và Unit Testing (Backend Service Layer). </w:t>
+      </w:r>
+    </w:p>
+    <w:p>
+      <w:pPr>
+        <w:jc w:val="both"/>
+        <w:rPr>
+          <w:rFonts w:ascii="Times New Roman" w:hAnsi="Times New Roman" w:cs="Times New Roman"/>
+          <w:sz w:val="26"/>
+          <w:szCs w:val="26"/>
+        </w:rPr>
+      </w:pPr>
+      <w:r>
+        <w:rPr>
+          <w:rFonts w:ascii="Times New Roman" w:hAnsi="Times New Roman" w:cs="Times New Roman"/>
+          <w:sz w:val="26"/>
+          <w:szCs w:val="26"/>
+        </w:rPr>
+        <w:t xml:space="preserve">+ Thiết lập Môi trường kiểm thử (Test Environment) và quy trình chuẩn quản lý/reset dữ liệu kiểm thử trên PostgreSQL. </w:t>
+      </w:r>
+    </w:p>
+    <w:p>
+      <w:pPr>
+        <w:jc w:val="both"/>
+        <w:rPr>
+          <w:rFonts w:ascii="Times New Roman" w:hAnsi="Times New Roman" w:cs="Times New Roman"/>
+          <w:sz w:val="26"/>
+          <w:szCs w:val="26"/>
+        </w:rPr>
+      </w:pPr>
+      <w:r>
+        <w:rPr>
+          <w:rFonts w:ascii="Times New Roman" w:hAnsi="Times New Roman" w:cs="Times New Roman"/>
+          <w:sz w:val="26"/>
+          <w:szCs w:val="26"/>
+        </w:rPr>
+        <w:t xml:space="preserve">+ Phân công công việc cho </w:t>
+      </w:r>
+      <w:r>
+        <w:rPr>
+          <w:rFonts w:ascii="Times New Roman" w:hAnsi="Times New Roman" w:cs="Times New Roman"/>
+          <w:sz w:val="26"/>
+          <w:szCs w:val="26"/>
+        </w:rPr>
+        <w:t>3</w:t>
+      </w:r>
+      <w:r>
+        <w:rPr>
+          <w:rFonts w:ascii="Times New Roman" w:hAnsi="Times New Roman" w:cs="Times New Roman"/>
+          <w:sz w:val="26"/>
+          <w:szCs w:val="26"/>
+        </w:rPr>
+        <w:t xml:space="preserve"> thành viên lập lịch trình thực thi chi tiết và thiết lập tiêu chí đánh giá chất lượng (Pass/Exit Criteria) thực tế cho hệ thống.</w:t>
+      </w:r>
+    </w:p>
+    <w:p>
+      <w:pPr>
+        <w:jc w:val="both"/>
+        <w:rPr>
+          <w:rFonts w:ascii="Times New Roman" w:hAnsi="Times New Roman" w:cs="Times New Roman"/>
+          <w:sz w:val="26"/>
+          <w:szCs w:val="26"/>
+        </w:rPr>
+      </w:pPr>
+    </w:p>
+    <w:p>
+      <w:pPr>
+        <w:pStyle w:val="Heading1"/>
+        <w:jc w:val="both"/>
+        <w:rPr>
+          <w:szCs w:val="26"/>
+        </w:rPr>
+      </w:pPr>
+      <w:bookmarkStart w:id="1" w:name="_Toc238059507"/>
+      <w:r>
+        <w:rPr>
+          <w:szCs w:val="26"/>
+        </w:rPr>
+        <w:t>2. PHẠM VI KIỂM THỬ (Test Scope)</w:t>
+      </w:r>
       <w:bookmarkEnd w:id="1"/>
     </w:p>
     <w:p>
       <w:pPr>
-        <w:jc w:val="both"/>
-        <w:rPr>
-          <w:rFonts w:ascii="Times New Roman" w:hAnsi="Times New Roman" w:cs="Times New Roman"/>
-          <w:sz w:val="26"/>
-          <w:szCs w:val="26"/>
-        </w:rPr>
-      </w:pPr>
-      <w:r>
-        <w:rPr>
-          <w:rFonts w:ascii="Times New Roman" w:hAnsi="Times New Roman" w:cs="Times New Roman"/>
-          <w:sz w:val="26"/>
-          <w:szCs w:val="26"/>
-        </w:rPr>
-        <w:t>Tài liệu Kế hoạch Kiểm thử (Test Plan) này nhằm mục đích:</w:t>
-      </w:r>
-    </w:p>
-    <w:p>
-      <w:pPr>
-        <w:jc w:val="both"/>
-        <w:rPr>
-          <w:rFonts w:ascii="Times New Roman" w:hAnsi="Times New Roman" w:cs="Times New Roman"/>
-          <w:sz w:val="26"/>
-          <w:szCs w:val="26"/>
-        </w:rPr>
-      </w:pPr>
-      <w:r>
-        <w:rPr>
-          <w:rFonts w:ascii="Times New Roman" w:hAnsi="Times New Roman" w:cs="Times New Roman"/>
-          <w:sz w:val="26"/>
-          <w:szCs w:val="26"/>
-        </w:rPr>
-        <w:t xml:space="preserve">+ Xác định rõ Phạm vi (In-Scope) và Ngoài phạm vi (Out-of-Scope) kiểm thử cho 3 tuần làm việc còn lại của đồ án môn Kiểm chứng Phần mềm. </w:t>
-      </w:r>
-    </w:p>
-    <w:p>
-      <w:pPr>
-        <w:jc w:val="both"/>
-        <w:rPr>
-          <w:rFonts w:ascii="Times New Roman" w:hAnsi="Times New Roman" w:cs="Times New Roman"/>
-          <w:sz w:val="26"/>
-          <w:szCs w:val="26"/>
-        </w:rPr>
-      </w:pPr>
-      <w:r>
-        <w:rPr>
-          <w:rFonts w:ascii="Times New Roman" w:hAnsi="Times New Roman" w:cs="Times New Roman"/>
-          <w:sz w:val="26"/>
-          <w:szCs w:val="26"/>
-        </w:rPr>
-        <w:t xml:space="preserve">+ Thống nhất Chiến lược kiểm thử (Test Strategy) kết hợp giữa Manual Testing (Giao diện FE), API Automation Testing (Postman/Newman) và Unit Testing (Backend Service Layer). </w:t>
-      </w:r>
-    </w:p>
-    <w:p>
-      <w:pPr>
-        <w:jc w:val="both"/>
-        <w:rPr>
-          <w:rFonts w:ascii="Times New Roman" w:hAnsi="Times New Roman" w:cs="Times New Roman"/>
-          <w:sz w:val="26"/>
-          <w:szCs w:val="26"/>
-        </w:rPr>
-      </w:pPr>
-      <w:r>
-        <w:rPr>
-          <w:rFonts w:ascii="Times New Roman" w:hAnsi="Times New Roman" w:cs="Times New Roman"/>
-          <w:sz w:val="26"/>
-          <w:szCs w:val="26"/>
-        </w:rPr>
-        <w:t xml:space="preserve">+ Thiết lập Môi trường kiểm thử (Test Environment) và quy trình chuẩn quản lý/reset dữ liệu kiểm thử trên PostgreSQL. </w:t>
-      </w:r>
-    </w:p>
-    <w:p>
-      <w:pPr>
-        <w:jc w:val="both"/>
-        <w:rPr>
-          <w:rFonts w:ascii="Times New Roman" w:hAnsi="Times New Roman" w:cs="Times New Roman"/>
-          <w:sz w:val="26"/>
-          <w:szCs w:val="26"/>
-        </w:rPr>
-      </w:pPr>
-      <w:r>
-        <w:rPr>
-          <w:rFonts w:ascii="Times New Roman" w:hAnsi="Times New Roman" w:cs="Times New Roman"/>
-          <w:sz w:val="26"/>
-          <w:szCs w:val="26"/>
-        </w:rPr>
-        <w:t>+ Phân công công việc cho 4 thành viên lập lịch trình thực thi chi tiết và thiết lập tiêu chí đánh giá chất lượng (Pass/Exit Criteria) thực tế cho hệ thống.</w:t>
-      </w:r>
-    </w:p>
-    <w:p>
-      <w:pPr>
-        <w:jc w:val="both"/>
-        <w:rPr>
-          <w:rFonts w:ascii="Times New Roman" w:hAnsi="Times New Roman" w:cs="Times New Roman"/>
-          <w:sz w:val="26"/>
-          <w:szCs w:val="26"/>
-        </w:rPr>
-      </w:pPr>
-    </w:p>
-    <w:p>
-      <w:pPr>
-        <w:pStyle w:val="Heading1"/>
-        <w:jc w:val="both"/>
-        <w:rPr>
-          <w:szCs w:val="26"/>
-        </w:rPr>
-      </w:pPr>
-      <w:bookmarkStart w:id="2" w:name="_Toc237628323"/>
-      <w:r>
-        <w:rPr>
-          <w:szCs w:val="26"/>
-        </w:rPr>
-        <w:t>2. PHẠM VI KIỂM THỬ (Test Scope)</w:t>
+        <w:pStyle w:val="Heading2"/>
+        <w:jc w:val="both"/>
+        <w:rPr>
+          <w:szCs w:val="26"/>
+        </w:rPr>
+      </w:pPr>
+      <w:bookmarkStart w:id="2" w:name="_Toc238059508"/>
+      <w:r>
+        <w:rPr>
+          <w:szCs w:val="26"/>
+        </w:rPr>
+        <w:t>2.1 Phạm vi kiểm thử (In-Scope)</w:t>
       </w:r>
       <w:bookmarkEnd w:id="2"/>
-    </w:p>
-    <w:p>
-      <w:pPr>
-        <w:pStyle w:val="Heading2"/>
-        <w:jc w:val="both"/>
-        <w:rPr>
-          <w:szCs w:val="26"/>
-        </w:rPr>
-      </w:pPr>
-      <w:bookmarkStart w:id="3" w:name="_Toc237628324"/>
-      <w:r>
-        <w:rPr>
-          <w:szCs w:val="26"/>
-        </w:rPr>
-        <w:t>2.1 Phạm vi kiểm thử (In-Scope)</w:t>
-      </w:r>
-      <w:bookmarkEnd w:id="3"/>
     </w:p>
     <w:p>
       <w:pPr>
@@ -2751,6 +2834,7 @@
                 <w:sz w:val="26"/>
                 <w:szCs w:val="26"/>
               </w:rPr>
+              <w:lastRenderedPageBreak/>
               <w:t>2</w:t>
             </w:r>
           </w:p>
@@ -2831,7 +2915,6 @@
                 <w:sz w:val="26"/>
                 <w:szCs w:val="26"/>
               </w:rPr>
-              <w:lastRenderedPageBreak/>
               <w:t>- Ràng buộc bảo mật (chỉ xem/sửa profile chính chủ).</w:t>
             </w:r>
           </w:p>
@@ -2855,7 +2938,6 @@
                 <w:sz w:val="26"/>
                 <w:szCs w:val="26"/>
               </w:rPr>
-              <w:lastRenderedPageBreak/>
               <w:t>FE Manual + API Postman + Unit Test</w:t>
             </w:r>
           </w:p>
@@ -3406,175 +3488,167 @@
           <w:szCs w:val="26"/>
         </w:rPr>
       </w:pPr>
-      <w:bookmarkStart w:id="4" w:name="_Toc237628325"/>
+      <w:bookmarkStart w:id="3" w:name="_Toc238059509"/>
       <w:r>
         <w:rPr>
           <w:szCs w:val="26"/>
         </w:rPr>
         <w:t>2.2 Ngoài phạm vi kiểm thử (Out-of-Scope)</w:t>
       </w:r>
+      <w:bookmarkEnd w:id="3"/>
+    </w:p>
+    <w:p>
+      <w:pPr>
+        <w:jc w:val="both"/>
+        <w:rPr>
+          <w:rFonts w:ascii="Times New Roman" w:hAnsi="Times New Roman" w:cs="Times New Roman"/>
+          <w:sz w:val="26"/>
+          <w:szCs w:val="26"/>
+        </w:rPr>
+      </w:pPr>
+      <w:r>
+        <w:rPr>
+          <w:rFonts w:ascii="Times New Roman" w:hAnsi="Times New Roman" w:cs="Times New Roman"/>
+          <w:sz w:val="26"/>
+          <w:szCs w:val="26"/>
+        </w:rPr>
+        <w:t xml:space="preserve">Các hạng mục sau </w:t>
+      </w:r>
+      <w:r>
+        <w:rPr>
+          <w:rFonts w:ascii="Times New Roman" w:hAnsi="Times New Roman" w:cs="Times New Roman"/>
+          <w:sz w:val="26"/>
+          <w:szCs w:val="26"/>
+        </w:rPr>
+        <w:t>không</w:t>
+      </w:r>
+      <w:r>
+        <w:rPr>
+          <w:rFonts w:ascii="Times New Roman" w:hAnsi="Times New Roman" w:cs="Times New Roman"/>
+          <w:sz w:val="26"/>
+          <w:szCs w:val="26"/>
+        </w:rPr>
+        <w:t xml:space="preserve"> nằm trong phạm vi kiểm thử của đồ án này: </w:t>
+      </w:r>
+    </w:p>
+    <w:p>
+      <w:pPr>
+        <w:jc w:val="both"/>
+        <w:rPr>
+          <w:rFonts w:ascii="Times New Roman" w:hAnsi="Times New Roman" w:cs="Times New Roman"/>
+          <w:sz w:val="26"/>
+          <w:szCs w:val="26"/>
+        </w:rPr>
+      </w:pPr>
+      <w:r>
+        <w:rPr>
+          <w:rFonts w:ascii="Times New Roman" w:hAnsi="Times New Roman" w:cs="Times New Roman"/>
+          <w:sz w:val="26"/>
+          <w:szCs w:val="26"/>
+        </w:rPr>
+        <w:lastRenderedPageBreak/>
+        <w:t xml:space="preserve">+ Chức năng "Thêm sản phẩm mới" phía Frontend (UI): Qua phân tích mã nguồn Angular 7 (F12 Network Log), hệ thống chỉ có API POST /seller/product/new và không triển khai giao diện UI tương ứng. Do đó, chức năng này là API-Only (chỉ test qua Postman/Newman, không tạo Test Case FE Manual). </w:t>
+      </w:r>
+    </w:p>
+    <w:p>
+      <w:pPr>
+        <w:jc w:val="both"/>
+        <w:rPr>
+          <w:rFonts w:ascii="Times New Roman" w:hAnsi="Times New Roman" w:cs="Times New Roman"/>
+          <w:sz w:val="26"/>
+          <w:szCs w:val="26"/>
+        </w:rPr>
+      </w:pPr>
+      <w:r>
+        <w:rPr>
+          <w:rFonts w:ascii="Times New Roman" w:hAnsi="Times New Roman" w:cs="Times New Roman"/>
+          <w:sz w:val="26"/>
+          <w:szCs w:val="26"/>
+        </w:rPr>
+        <w:t xml:space="preserve">+ Kiểm thử hiệu năng &amp; Tải (Performance &amp; Load Testing): Không đo lường khả năng chịu tải nặng hay phản hồi đồng thời hàng nghìn user. </w:t>
+      </w:r>
+    </w:p>
+    <w:p>
+      <w:pPr>
+        <w:jc w:val="both"/>
+        <w:rPr>
+          <w:rFonts w:ascii="Times New Roman" w:hAnsi="Times New Roman" w:cs="Times New Roman"/>
+          <w:sz w:val="26"/>
+          <w:szCs w:val="26"/>
+        </w:rPr>
+      </w:pPr>
+      <w:r>
+        <w:rPr>
+          <w:rFonts w:ascii="Times New Roman" w:hAnsi="Times New Roman" w:cs="Times New Roman"/>
+          <w:sz w:val="26"/>
+          <w:szCs w:val="26"/>
+        </w:rPr>
+        <w:t xml:space="preserve">+ Cổng thanh toán thực tế (Payment Gateway): Không tích hợp VNPay, MoMo, ZaloPay thực tế. </w:t>
+      </w:r>
+    </w:p>
+    <w:p>
+      <w:pPr>
+        <w:jc w:val="both"/>
+        <w:rPr>
+          <w:rFonts w:ascii="Times New Roman" w:hAnsi="Times New Roman" w:cs="Times New Roman"/>
+          <w:sz w:val="26"/>
+          <w:szCs w:val="26"/>
+        </w:rPr>
+      </w:pPr>
+      <w:r>
+        <w:rPr>
+          <w:rFonts w:ascii="Times New Roman" w:hAnsi="Times New Roman" w:cs="Times New Roman"/>
+          <w:sz w:val="26"/>
+          <w:szCs w:val="26"/>
+        </w:rPr>
+        <w:t xml:space="preserve">+ Ứng dụng di động (Mobile Native App): Hệ thống chỉ chạy trên nền tảng Web Browser. </w:t>
+      </w:r>
+    </w:p>
+    <w:p>
+      <w:pPr>
+        <w:jc w:val="both"/>
+        <w:rPr>
+          <w:rFonts w:ascii="Times New Roman" w:hAnsi="Times New Roman" w:cs="Times New Roman"/>
+          <w:sz w:val="26"/>
+          <w:szCs w:val="26"/>
+        </w:rPr>
+      </w:pPr>
+      <w:r>
+        <w:rPr>
+          <w:rFonts w:ascii="Times New Roman" w:hAnsi="Times New Roman" w:cs="Times New Roman"/>
+          <w:sz w:val="26"/>
+          <w:szCs w:val="26"/>
+        </w:rPr>
+        <w:t>+ Bảo mật chuyên sâu (Penetration Testing): Không test các lỗ hổng tầng hạ tầng/máy chủ phức tạp.</w:t>
+      </w:r>
+    </w:p>
+    <w:p>
+      <w:pPr>
+        <w:ind w:firstLine="720"/>
+        <w:jc w:val="both"/>
+        <w:rPr>
+          <w:rFonts w:ascii="Times New Roman" w:hAnsi="Times New Roman" w:cs="Times New Roman"/>
+          <w:sz w:val="26"/>
+          <w:szCs w:val="26"/>
+        </w:rPr>
+      </w:pPr>
+    </w:p>
+    <w:p>
+      <w:pPr>
+        <w:pStyle w:val="Heading1"/>
+        <w:jc w:val="both"/>
+        <w:rPr>
+          <w:szCs w:val="26"/>
+        </w:rPr>
+      </w:pPr>
+      <w:bookmarkStart w:id="4" w:name="_Toc238059510"/>
+      <w:r>
+        <w:rPr>
+          <w:szCs w:val="26"/>
+        </w:rPr>
+        <w:t>3. CHIẾN LƯỢC KIỂM THỬ (Test Strategy)</w:t>
+      </w:r>
       <w:bookmarkEnd w:id="4"/>
-    </w:p>
-    <w:p>
-      <w:pPr>
-        <w:jc w:val="both"/>
-        <w:rPr>
-          <w:rFonts w:ascii="Times New Roman" w:hAnsi="Times New Roman" w:cs="Times New Roman"/>
-          <w:sz w:val="26"/>
-          <w:szCs w:val="26"/>
-        </w:rPr>
-      </w:pPr>
-      <w:r>
-        <w:rPr>
-          <w:rFonts w:ascii="Times New Roman" w:hAnsi="Times New Roman" w:cs="Times New Roman"/>
-          <w:sz w:val="26"/>
-          <w:szCs w:val="26"/>
-        </w:rPr>
-        <w:t xml:space="preserve">Các hạng mục sau </w:t>
-      </w:r>
-      <w:r>
-        <w:rPr>
-          <w:rFonts w:ascii="Times New Roman" w:hAnsi="Times New Roman" w:cs="Times New Roman"/>
-          <w:sz w:val="26"/>
-          <w:szCs w:val="26"/>
-        </w:rPr>
-        <w:t>không</w:t>
-      </w:r>
-      <w:r>
-        <w:rPr>
-          <w:rFonts w:ascii="Times New Roman" w:hAnsi="Times New Roman" w:cs="Times New Roman"/>
-          <w:sz w:val="26"/>
-          <w:szCs w:val="26"/>
-        </w:rPr>
-        <w:t xml:space="preserve"> nằm trong phạm vi kiểm thử của đồ án này: </w:t>
-      </w:r>
-    </w:p>
-    <w:p>
-      <w:pPr>
-        <w:jc w:val="both"/>
-        <w:rPr>
-          <w:rFonts w:ascii="Times New Roman" w:hAnsi="Times New Roman" w:cs="Times New Roman"/>
-          <w:sz w:val="26"/>
-          <w:szCs w:val="26"/>
-        </w:rPr>
-      </w:pPr>
-      <w:r>
-        <w:rPr>
-          <w:rFonts w:ascii="Times New Roman" w:hAnsi="Times New Roman" w:cs="Times New Roman"/>
-          <w:sz w:val="26"/>
-          <w:szCs w:val="26"/>
-        </w:rPr>
-        <w:t xml:space="preserve">+ Chức năng "Thêm sản phẩm mới" phía Frontend (UI): Qua phân tích mã nguồn Angular 7 (F12 Network Log), hệ thống chỉ có API POST /seller/product/new và không triển khai </w:t>
-      </w:r>
-      <w:r>
-        <w:rPr>
-          <w:rFonts w:ascii="Times New Roman" w:hAnsi="Times New Roman" w:cs="Times New Roman"/>
-          <w:sz w:val="26"/>
-          <w:szCs w:val="26"/>
-        </w:rPr>
-        <w:lastRenderedPageBreak/>
-        <w:t xml:space="preserve">giao diện UI tương ứng. Do đó, chức năng này là API-Only (chỉ test qua Postman/Newman, không tạo Test Case FE Manual). </w:t>
-      </w:r>
-    </w:p>
-    <w:p>
-      <w:pPr>
-        <w:jc w:val="both"/>
-        <w:rPr>
-          <w:rFonts w:ascii="Times New Roman" w:hAnsi="Times New Roman" w:cs="Times New Roman"/>
-          <w:sz w:val="26"/>
-          <w:szCs w:val="26"/>
-        </w:rPr>
-      </w:pPr>
-      <w:r>
-        <w:rPr>
-          <w:rFonts w:ascii="Times New Roman" w:hAnsi="Times New Roman" w:cs="Times New Roman"/>
-          <w:sz w:val="26"/>
-          <w:szCs w:val="26"/>
-        </w:rPr>
-        <w:t xml:space="preserve">+ Kiểm thử hiệu năng &amp; Tải (Performance &amp; Load Testing): Không đo lường khả năng chịu tải nặng hay phản hồi đồng thời hàng nghìn user. </w:t>
-      </w:r>
-    </w:p>
-    <w:p>
-      <w:pPr>
-        <w:jc w:val="both"/>
-        <w:rPr>
-          <w:rFonts w:ascii="Times New Roman" w:hAnsi="Times New Roman" w:cs="Times New Roman"/>
-          <w:sz w:val="26"/>
-          <w:szCs w:val="26"/>
-        </w:rPr>
-      </w:pPr>
-      <w:r>
-        <w:rPr>
-          <w:rFonts w:ascii="Times New Roman" w:hAnsi="Times New Roman" w:cs="Times New Roman"/>
-          <w:sz w:val="26"/>
-          <w:szCs w:val="26"/>
-        </w:rPr>
-        <w:t xml:space="preserve">+ Cổng thanh toán thực tế (Payment Gateway): Không tích hợp VNPay, MoMo, ZaloPay thực tế. </w:t>
-      </w:r>
-    </w:p>
-    <w:p>
-      <w:pPr>
-        <w:jc w:val="both"/>
-        <w:rPr>
-          <w:rFonts w:ascii="Times New Roman" w:hAnsi="Times New Roman" w:cs="Times New Roman"/>
-          <w:sz w:val="26"/>
-          <w:szCs w:val="26"/>
-        </w:rPr>
-      </w:pPr>
-      <w:r>
-        <w:rPr>
-          <w:rFonts w:ascii="Times New Roman" w:hAnsi="Times New Roman" w:cs="Times New Roman"/>
-          <w:sz w:val="26"/>
-          <w:szCs w:val="26"/>
-        </w:rPr>
-        <w:t xml:space="preserve">+ Ứng dụng di động (Mobile Native App): Hệ thống chỉ chạy trên nền tảng Web Browser. </w:t>
-      </w:r>
-    </w:p>
-    <w:p>
-      <w:pPr>
-        <w:jc w:val="both"/>
-        <w:rPr>
-          <w:rFonts w:ascii="Times New Roman" w:hAnsi="Times New Roman" w:cs="Times New Roman"/>
-          <w:sz w:val="26"/>
-          <w:szCs w:val="26"/>
-        </w:rPr>
-      </w:pPr>
-      <w:r>
-        <w:rPr>
-          <w:rFonts w:ascii="Times New Roman" w:hAnsi="Times New Roman" w:cs="Times New Roman"/>
-          <w:sz w:val="26"/>
-          <w:szCs w:val="26"/>
-        </w:rPr>
-        <w:t>+ Bảo mật chuyên sâu (Penetration Testing): Không test các lỗ hổng tầng hạ tầng/máy chủ phức tạp.</w:t>
-      </w:r>
-    </w:p>
-    <w:p>
-      <w:pPr>
-        <w:ind w:firstLine="720"/>
-        <w:jc w:val="both"/>
-        <w:rPr>
-          <w:rFonts w:ascii="Times New Roman" w:hAnsi="Times New Roman" w:cs="Times New Roman"/>
-          <w:sz w:val="26"/>
-          <w:szCs w:val="26"/>
-        </w:rPr>
-      </w:pPr>
-    </w:p>
-    <w:p>
-      <w:pPr>
-        <w:pStyle w:val="Heading1"/>
-        <w:jc w:val="both"/>
-        <w:rPr>
-          <w:szCs w:val="26"/>
-        </w:rPr>
-      </w:pPr>
-      <w:bookmarkStart w:id="5" w:name="_Toc237628326"/>
-      <w:r>
-        <w:rPr>
-          <w:szCs w:val="26"/>
-        </w:rPr>
-        <w:t>3. CHIẾN LƯỢC KIỂM THỬ (Test Strategy)</w:t>
-      </w:r>
-      <w:bookmarkEnd w:id="5"/>
     </w:p>
     <w:p>
       <w:pPr>
@@ -3970,9 +4044,8 @@
                 <w:rFonts w:ascii="Times New Roman" w:eastAsia="SimSun" w:hAnsi="Times New Roman" w:cs="Times New Roman"/>
                 <w:sz w:val="24"/>
                 <w:szCs w:val="24"/>
-                <w:lang w:val="vi-VN"/>
-              </w:rPr>
-              <w:t>4</w:t>
+              </w:rPr>
+              <w:t>3</w:t>
             </w:r>
             <w:r>
               <w:rPr>
@@ -4028,13 +4101,149 @@
           <w:szCs w:val="26"/>
         </w:rPr>
       </w:pPr>
-      <w:bookmarkStart w:id="6" w:name="_Toc237628327"/>
+      <w:bookmarkStart w:id="5" w:name="_Toc238059511"/>
       <w:r>
         <w:rPr>
           <w:szCs w:val="26"/>
         </w:rPr>
         <w:t>3.1 Tầng 1: Manual Testing trên Frontend (Angular 7)</w:t>
       </w:r>
+      <w:bookmarkEnd w:id="5"/>
+    </w:p>
+    <w:p>
+      <w:pPr>
+        <w:jc w:val="both"/>
+        <w:rPr>
+          <w:rFonts w:ascii="Times New Roman" w:hAnsi="Times New Roman" w:cs="Times New Roman"/>
+          <w:sz w:val="26"/>
+          <w:szCs w:val="26"/>
+        </w:rPr>
+      </w:pPr>
+      <w:r>
+        <w:rPr>
+          <w:rFonts w:ascii="Times New Roman" w:hAnsi="Times New Roman" w:cs="Times New Roman"/>
+          <w:sz w:val="26"/>
+          <w:szCs w:val="26"/>
+        </w:rPr>
+        <w:t xml:space="preserve">Phương pháp: Kiểm thử thủ công từng màn hình giao diện. </w:t>
+      </w:r>
+    </w:p>
+    <w:p>
+      <w:pPr>
+        <w:jc w:val="both"/>
+        <w:rPr>
+          <w:rFonts w:ascii="Times New Roman" w:hAnsi="Times New Roman" w:cs="Times New Roman"/>
+          <w:sz w:val="26"/>
+          <w:szCs w:val="26"/>
+        </w:rPr>
+      </w:pPr>
+      <w:r>
+        <w:rPr>
+          <w:rFonts w:ascii="Times New Roman" w:hAnsi="Times New Roman" w:cs="Times New Roman"/>
+          <w:sz w:val="26"/>
+          <w:szCs w:val="26"/>
+        </w:rPr>
+        <w:t>Mục tiêu:</w:t>
+      </w:r>
+    </w:p>
+    <w:p>
+      <w:pPr>
+        <w:jc w:val="both"/>
+        <w:rPr>
+          <w:rFonts w:ascii="Times New Roman" w:hAnsi="Times New Roman" w:cs="Times New Roman"/>
+          <w:sz w:val="26"/>
+          <w:szCs w:val="26"/>
+        </w:rPr>
+      </w:pPr>
+      <w:r>
+        <w:rPr>
+          <w:rFonts w:ascii="Times New Roman" w:hAnsi="Times New Roman" w:cs="Times New Roman"/>
+          <w:sz w:val="26"/>
+          <w:szCs w:val="26"/>
+        </w:rPr>
+        <w:t xml:space="preserve">+ Kiểm tra luồng người dùng (User Flows) trên các trình duyệt Chrome, Edge. </w:t>
+      </w:r>
+    </w:p>
+    <w:p>
+      <w:pPr>
+        <w:jc w:val="both"/>
+        <w:rPr>
+          <w:rFonts w:ascii="Times New Roman" w:hAnsi="Times New Roman" w:cs="Times New Roman"/>
+          <w:sz w:val="26"/>
+          <w:szCs w:val="26"/>
+        </w:rPr>
+      </w:pPr>
+      <w:r>
+        <w:rPr>
+          <w:rFonts w:ascii="Times New Roman" w:hAnsi="Times New Roman" w:cs="Times New Roman"/>
+          <w:sz w:val="26"/>
+          <w:szCs w:val="26"/>
+        </w:rPr>
+        <w:lastRenderedPageBreak/>
+        <w:t xml:space="preserve">+ Validation các form nhập liệu (Đăng ký, Đăng nhập, Sửa profile, Sửa sản phẩm). </w:t>
+      </w:r>
+    </w:p>
+    <w:p>
+      <w:pPr>
+        <w:jc w:val="both"/>
+        <w:rPr>
+          <w:rFonts w:ascii="Times New Roman" w:hAnsi="Times New Roman" w:cs="Times New Roman"/>
+          <w:sz w:val="26"/>
+          <w:szCs w:val="26"/>
+        </w:rPr>
+      </w:pPr>
+      <w:r>
+        <w:rPr>
+          <w:rFonts w:ascii="Times New Roman" w:hAnsi="Times New Roman" w:cs="Times New Roman"/>
+          <w:sz w:val="26"/>
+          <w:szCs w:val="26"/>
+        </w:rPr>
+        <w:t xml:space="preserve">+ Hiển thị thông báo Toast/Alert và phản hồi giao diện khi tương tác. </w:t>
+      </w:r>
+    </w:p>
+    <w:p>
+      <w:pPr>
+        <w:jc w:val="both"/>
+        <w:rPr>
+          <w:rFonts w:ascii="Times New Roman" w:hAnsi="Times New Roman" w:cs="Times New Roman"/>
+          <w:sz w:val="26"/>
+          <w:szCs w:val="26"/>
+        </w:rPr>
+      </w:pPr>
+      <w:r>
+        <w:rPr>
+          <w:rFonts w:ascii="Times New Roman" w:hAnsi="Times New Roman" w:cs="Times New Roman"/>
+          <w:sz w:val="26"/>
+          <w:szCs w:val="26"/>
+        </w:rPr>
+        <w:t>+ Phân quyền hiển thị nút/menu theo Role đăng nhập (Customer không thấy trang Admin, Manager thấy nút Sửa).</w:t>
+      </w:r>
+    </w:p>
+    <w:p>
+      <w:pPr>
+        <w:jc w:val="both"/>
+        <w:rPr>
+          <w:rFonts w:ascii="Times New Roman" w:hAnsi="Times New Roman" w:cs="Times New Roman"/>
+          <w:sz w:val="26"/>
+          <w:szCs w:val="26"/>
+        </w:rPr>
+      </w:pPr>
+    </w:p>
+    <w:p>
+      <w:pPr>
+        <w:pStyle w:val="Heading2"/>
+        <w:jc w:val="both"/>
+        <w:rPr>
+          <w:szCs w:val="26"/>
+        </w:rPr>
+      </w:pPr>
+      <w:bookmarkStart w:id="6" w:name="_Toc238059512"/>
+      <w:r>
+        <w:rPr>
+          <w:szCs w:val="26"/>
+        </w:rPr>
+        <w:t>3.2 Tầng 2: API Automation Testing (Postman &amp; Newman CLI)</w:t>
+      </w:r>
       <w:bookmarkEnd w:id="6"/>
     </w:p>
     <w:p>
@@ -4052,7 +4261,24 @@
           <w:sz w:val="26"/>
           <w:szCs w:val="26"/>
         </w:rPr>
-        <w:t xml:space="preserve">Phương pháp: Kiểm thử thủ công từng màn hình giao diện. </w:t>
+        <w:t>Phương</w:t>
+      </w:r>
+      <w:r>
+        <w:rPr>
+          <w:rFonts w:ascii="Times New Roman" w:hAnsi="Times New Roman" w:cs="Times New Roman"/>
+          <w:sz w:val="26"/>
+          <w:szCs w:val="26"/>
+          <w:lang w:val="vi-VN"/>
+        </w:rPr>
+        <w:t xml:space="preserve"> </w:t>
+      </w:r>
+      <w:r>
+        <w:rPr>
+          <w:rFonts w:ascii="Times New Roman" w:hAnsi="Times New Roman" w:cs="Times New Roman"/>
+          <w:sz w:val="26"/>
+          <w:szCs w:val="26"/>
+        </w:rPr>
+        <w:t xml:space="preserve">pháp: Sử dụng Postman Collection OnlineShoppingStore.postman_collection.json và Environment environment.dev.postman_environment.json. </w:t>
       </w:r>
     </w:p>
     <w:p>
@@ -4088,62 +4314,61 @@
           <w:sz w:val="26"/>
           <w:szCs w:val="26"/>
         </w:rPr>
-        <w:t xml:space="preserve">+ Kiểm tra luồng người dùng (User Flows) trên các trình duyệt Chrome, Edge. </w:t>
-      </w:r>
-    </w:p>
-    <w:p>
-      <w:pPr>
-        <w:jc w:val="both"/>
-        <w:rPr>
-          <w:rFonts w:ascii="Times New Roman" w:hAnsi="Times New Roman" w:cs="Times New Roman"/>
-          <w:sz w:val="26"/>
-          <w:szCs w:val="26"/>
-        </w:rPr>
-      </w:pPr>
-      <w:r>
-        <w:rPr>
-          <w:rFonts w:ascii="Times New Roman" w:hAnsi="Times New Roman" w:cs="Times New Roman"/>
-          <w:sz w:val="26"/>
-          <w:szCs w:val="26"/>
-        </w:rPr>
-        <w:t xml:space="preserve">+ Validation các form nhập liệu (Đăng ký, Đăng nhập, Sửa profile, Sửa sản phẩm). </w:t>
-      </w:r>
-    </w:p>
-    <w:p>
-      <w:pPr>
-        <w:jc w:val="both"/>
-        <w:rPr>
-          <w:rFonts w:ascii="Times New Roman" w:hAnsi="Times New Roman" w:cs="Times New Roman"/>
-          <w:sz w:val="26"/>
-          <w:szCs w:val="26"/>
-        </w:rPr>
-      </w:pPr>
-      <w:r>
-        <w:rPr>
-          <w:rFonts w:ascii="Times New Roman" w:hAnsi="Times New Roman" w:cs="Times New Roman"/>
-          <w:sz w:val="26"/>
-          <w:szCs w:val="26"/>
-        </w:rPr>
-        <w:t xml:space="preserve">+ Hiển thị thông báo Toast/Alert và phản hồi giao diện khi tương tác. </w:t>
-      </w:r>
-    </w:p>
-    <w:p>
-      <w:pPr>
-        <w:jc w:val="both"/>
-        <w:rPr>
-          <w:rFonts w:ascii="Times New Roman" w:hAnsi="Times New Roman" w:cs="Times New Roman"/>
-          <w:sz w:val="26"/>
-          <w:szCs w:val="26"/>
-        </w:rPr>
-      </w:pPr>
-      <w:r>
-        <w:rPr>
-          <w:rFonts w:ascii="Times New Roman" w:hAnsi="Times New Roman" w:cs="Times New Roman"/>
-          <w:sz w:val="26"/>
-          <w:szCs w:val="26"/>
-        </w:rPr>
-        <w:lastRenderedPageBreak/>
-        <w:t>+ Phân quyền hiển thị nút/menu theo Role đăng nhập (Customer không thấy trang Admin, Manager thấy nút Sửa).</w:t>
+        <w:t>+ Kiểm thử tự động hóa toàn bộ 42 request API (bao gồm Positive, Negative và Security Cases).</w:t>
+      </w:r>
+    </w:p>
+    <w:p>
+      <w:pPr>
+        <w:jc w:val="both"/>
+        <w:rPr>
+          <w:rFonts w:ascii="Times New Roman" w:hAnsi="Times New Roman" w:cs="Times New Roman"/>
+          <w:sz w:val="26"/>
+          <w:szCs w:val="26"/>
+        </w:rPr>
+      </w:pPr>
+      <w:r>
+        <w:rPr>
+          <w:rFonts w:ascii="Times New Roman" w:hAnsi="Times New Roman" w:cs="Times New Roman"/>
+          <w:sz w:val="26"/>
+          <w:szCs w:val="26"/>
+        </w:rPr>
+        <w:t xml:space="preserve">+ Kiểm tra HTTP Status Codes (200, 400, 401, 403, 500). </w:t>
+      </w:r>
+    </w:p>
+    <w:p>
+      <w:pPr>
+        <w:jc w:val="both"/>
+        <w:rPr>
+          <w:rFonts w:ascii="Times New Roman" w:hAnsi="Times New Roman" w:cs="Times New Roman"/>
+          <w:sz w:val="26"/>
+          <w:szCs w:val="26"/>
+        </w:rPr>
+      </w:pPr>
+      <w:r>
+        <w:rPr>
+          <w:rFonts w:ascii="Times New Roman" w:hAnsi="Times New Roman" w:cs="Times New Roman"/>
+          <w:sz w:val="26"/>
+          <w:szCs w:val="26"/>
+        </w:rPr>
+        <w:t>+ Bắt các lỗi Backend kín (như Jackson Serialization BindingResult, Uncaught OrderNotFound Exception).</w:t>
+      </w:r>
+    </w:p>
+    <w:p>
+      <w:pPr>
+        <w:jc w:val="both"/>
+        <w:rPr>
+          <w:rFonts w:ascii="Times New Roman" w:hAnsi="Times New Roman" w:cs="Times New Roman"/>
+          <w:sz w:val="26"/>
+          <w:szCs w:val="26"/>
+        </w:rPr>
+      </w:pPr>
+      <w:r>
+        <w:rPr>
+          <w:rFonts w:ascii="Times New Roman" w:hAnsi="Times New Roman" w:cs="Times New Roman"/>
+          <w:sz w:val="26"/>
+          <w:szCs w:val="26"/>
+        </w:rPr>
+        <w:t>+ Tự động xuất báo cáo HTML trực quan bằng gói newman-reporter-htmlextra để làm minh chứng.</w:t>
       </w:r>
     </w:p>
     <w:p>
@@ -4164,166 +4389,14 @@
           <w:szCs w:val="26"/>
         </w:rPr>
       </w:pPr>
-      <w:bookmarkStart w:id="7" w:name="_Toc237628328"/>
-      <w:r>
-        <w:rPr>
-          <w:szCs w:val="26"/>
-        </w:rPr>
-        <w:t>3.2 Tầng 2: API Automation Testing (Postman &amp; Newman CLI)</w:t>
+      <w:bookmarkStart w:id="7" w:name="_Toc238059513"/>
+      <w:r>
+        <w:rPr>
+          <w:szCs w:val="26"/>
+        </w:rPr>
+        <w:t>3.3 Tầng 3: Unit Testing trên Backend Service Layer</w:t>
       </w:r>
       <w:bookmarkEnd w:id="7"/>
-    </w:p>
-    <w:p>
-      <w:pPr>
-        <w:jc w:val="both"/>
-        <w:rPr>
-          <w:rFonts w:ascii="Times New Roman" w:hAnsi="Times New Roman" w:cs="Times New Roman"/>
-          <w:sz w:val="26"/>
-          <w:szCs w:val="26"/>
-        </w:rPr>
-      </w:pPr>
-      <w:r>
-        <w:rPr>
-          <w:rFonts w:ascii="Times New Roman" w:hAnsi="Times New Roman" w:cs="Times New Roman"/>
-          <w:sz w:val="26"/>
-          <w:szCs w:val="26"/>
-        </w:rPr>
-        <w:t>Phương</w:t>
-      </w:r>
-      <w:r>
-        <w:rPr>
-          <w:rFonts w:ascii="Times New Roman" w:hAnsi="Times New Roman" w:cs="Times New Roman"/>
-          <w:sz w:val="26"/>
-          <w:szCs w:val="26"/>
-          <w:lang w:val="vi-VN"/>
-        </w:rPr>
-        <w:t xml:space="preserve"> </w:t>
-      </w:r>
-      <w:r>
-        <w:rPr>
-          <w:rFonts w:ascii="Times New Roman" w:hAnsi="Times New Roman" w:cs="Times New Roman"/>
-          <w:sz w:val="26"/>
-          <w:szCs w:val="26"/>
-        </w:rPr>
-        <w:t xml:space="preserve">pháp: Sử dụng Postman Collection OnlineShoppingStore.postman_collection.json và Environment environment.dev.postman_environment.json. </w:t>
-      </w:r>
-    </w:p>
-    <w:p>
-      <w:pPr>
-        <w:jc w:val="both"/>
-        <w:rPr>
-          <w:rFonts w:ascii="Times New Roman" w:hAnsi="Times New Roman" w:cs="Times New Roman"/>
-          <w:sz w:val="26"/>
-          <w:szCs w:val="26"/>
-        </w:rPr>
-      </w:pPr>
-      <w:r>
-        <w:rPr>
-          <w:rFonts w:ascii="Times New Roman" w:hAnsi="Times New Roman" w:cs="Times New Roman"/>
-          <w:sz w:val="26"/>
-          <w:szCs w:val="26"/>
-        </w:rPr>
-        <w:t>Mục tiêu:</w:t>
-      </w:r>
-    </w:p>
-    <w:p>
-      <w:pPr>
-        <w:jc w:val="both"/>
-        <w:rPr>
-          <w:rFonts w:ascii="Times New Roman" w:hAnsi="Times New Roman" w:cs="Times New Roman"/>
-          <w:sz w:val="26"/>
-          <w:szCs w:val="26"/>
-        </w:rPr>
-      </w:pPr>
-      <w:r>
-        <w:rPr>
-          <w:rFonts w:ascii="Times New Roman" w:hAnsi="Times New Roman" w:cs="Times New Roman"/>
-          <w:sz w:val="26"/>
-          <w:szCs w:val="26"/>
-        </w:rPr>
-        <w:t>+ Kiểm thử tự động hóa toàn bộ 42 request API (bao gồm Positive, Negative và Security Cases).</w:t>
-      </w:r>
-    </w:p>
-    <w:p>
-      <w:pPr>
-        <w:jc w:val="both"/>
-        <w:rPr>
-          <w:rFonts w:ascii="Times New Roman" w:hAnsi="Times New Roman" w:cs="Times New Roman"/>
-          <w:sz w:val="26"/>
-          <w:szCs w:val="26"/>
-        </w:rPr>
-      </w:pPr>
-      <w:r>
-        <w:rPr>
-          <w:rFonts w:ascii="Times New Roman" w:hAnsi="Times New Roman" w:cs="Times New Roman"/>
-          <w:sz w:val="26"/>
-          <w:szCs w:val="26"/>
-        </w:rPr>
-        <w:t xml:space="preserve">+ Kiểm tra HTTP Status Codes (200, 400, 401, 403, 500). </w:t>
-      </w:r>
-    </w:p>
-    <w:p>
-      <w:pPr>
-        <w:jc w:val="both"/>
-        <w:rPr>
-          <w:rFonts w:ascii="Times New Roman" w:hAnsi="Times New Roman" w:cs="Times New Roman"/>
-          <w:sz w:val="26"/>
-          <w:szCs w:val="26"/>
-        </w:rPr>
-      </w:pPr>
-      <w:r>
-        <w:rPr>
-          <w:rFonts w:ascii="Times New Roman" w:hAnsi="Times New Roman" w:cs="Times New Roman"/>
-          <w:sz w:val="26"/>
-          <w:szCs w:val="26"/>
-        </w:rPr>
-        <w:t>+ Bắt các lỗi Backend kín (như Jackson Serialization BindingResult, Uncaught OrderNotFound Exception).</w:t>
-      </w:r>
-    </w:p>
-    <w:p>
-      <w:pPr>
-        <w:jc w:val="both"/>
-        <w:rPr>
-          <w:rFonts w:ascii="Times New Roman" w:hAnsi="Times New Roman" w:cs="Times New Roman"/>
-          <w:sz w:val="26"/>
-          <w:szCs w:val="26"/>
-        </w:rPr>
-      </w:pPr>
-      <w:r>
-        <w:rPr>
-          <w:rFonts w:ascii="Times New Roman" w:hAnsi="Times New Roman" w:cs="Times New Roman"/>
-          <w:sz w:val="26"/>
-          <w:szCs w:val="26"/>
-        </w:rPr>
-        <w:t>+ Tự động xuất báo cáo HTML trực quan bằng gói newman-reporter-htmlextra để làm minh chứng.</w:t>
-      </w:r>
-    </w:p>
-    <w:p>
-      <w:pPr>
-        <w:jc w:val="both"/>
-        <w:rPr>
-          <w:rFonts w:ascii="Times New Roman" w:hAnsi="Times New Roman" w:cs="Times New Roman"/>
-          <w:sz w:val="26"/>
-          <w:szCs w:val="26"/>
-        </w:rPr>
-      </w:pPr>
-    </w:p>
-    <w:p>
-      <w:pPr>
-        <w:pStyle w:val="Heading2"/>
-        <w:jc w:val="both"/>
-        <w:rPr>
-          <w:szCs w:val="26"/>
-        </w:rPr>
-      </w:pPr>
-      <w:bookmarkStart w:id="8" w:name="_Toc237628329"/>
-      <w:r>
-        <w:rPr>
-          <w:szCs w:val="26"/>
-        </w:rPr>
-        <w:t>3.3 Tầng 3: Unit Testing trên Backend Service Layer</w:t>
-      </w:r>
-      <w:bookmarkEnd w:id="8"/>
     </w:p>
     <w:p>
       <w:pPr>
@@ -4576,18 +4649,35 @@
           <w:sz w:val="26"/>
           <w:szCs w:val="26"/>
         </w:rPr>
+        <w:lastRenderedPageBreak/>
         <w:t>Viết tối thiểu 12 Unit Test và đánh giá Code Coverage Service Layer ≥ 70%.</w:t>
       </w:r>
     </w:p>
     <w:p>
       <w:pPr>
+        <w:pStyle w:val="ListParagraph"/>
+        <w:numPr>
+          <w:ilvl w:val="0"/>
+          <w:numId w:val="1"/>
+        </w:numPr>
+        <w:spacing w:line="360" w:lineRule="auto"/>
+        <w:jc w:val="both"/>
+        <w:rPr>
+          <w:rFonts w:ascii="Times New Roman" w:hAnsi="Times New Roman" w:cs="Times New Roman"/>
+          <w:sz w:val="26"/>
+          <w:szCs w:val="26"/>
+        </w:rPr>
+      </w:pPr>
+    </w:p>
+    <w:p>
+      <w:pPr>
         <w:pStyle w:val="Heading2"/>
       </w:pPr>
-      <w:bookmarkStart w:id="9" w:name="_Toc237628330"/>
+      <w:bookmarkStart w:id="8" w:name="_Toc238059514"/>
       <w:r>
         <w:t>3.4 Tầng 4: E2E Automation Testing (CodeceptJS &amp; Playwright)</w:t>
       </w:r>
-      <w:bookmarkEnd w:id="9"/>
+      <w:bookmarkEnd w:id="8"/>
     </w:p>
     <w:p>
       <w:pPr>
@@ -4606,7 +4696,6 @@
           <w:sz w:val="26"/>
           <w:szCs w:val="26"/>
         </w:rPr>
-        <w:lastRenderedPageBreak/>
         <w:t xml:space="preserve">Phương pháp: </w:t>
       </w:r>
       <w:r>
@@ -4847,7 +4936,7 @@
           <w:sz w:val="26"/>
           <w:szCs w:val="26"/>
         </w:rPr>
-        <w:t>Scope: CodeceptJS chỉ cover 5/44 case — không claim tự động hoá toàn bộ</w:t>
+        <w:t>Scope: CodeceptJS chỉ cover 5/4</w:t>
       </w:r>
       <w:r>
         <w:rPr>
@@ -4855,19 +4944,44 @@
           <w:sz w:val="26"/>
           <w:szCs w:val="26"/>
         </w:rPr>
+        <w:t>3</w:t>
+      </w:r>
+      <w:r>
+        <w:rPr>
+          <w:rFonts w:ascii="Times New Roman" w:eastAsia="sans-serif" w:hAnsi="Times New Roman" w:cs="Times New Roman"/>
+          <w:sz w:val="26"/>
+          <w:szCs w:val="26"/>
+        </w:rPr>
+        <w:t xml:space="preserve"> case — không claim tự động hoá toàn bộ</w:t>
+      </w:r>
+      <w:r>
+        <w:rPr>
+          <w:rFonts w:ascii="Times New Roman" w:eastAsia="sans-serif" w:hAnsi="Times New Roman" w:cs="Times New Roman"/>
+          <w:sz w:val="26"/>
+          <w:szCs w:val="26"/>
+        </w:rPr>
         <w:t>.</w:t>
       </w:r>
     </w:p>
     <w:p>
       <w:pPr>
+        <w:ind w:firstLine="131"/>
+        <w:rPr>
+          <w:rFonts w:ascii="Times New Roman" w:eastAsia="sans-serif" w:hAnsi="Times New Roman" w:cs="Times New Roman"/>
+          <w:sz w:val="26"/>
+          <w:szCs w:val="26"/>
+        </w:rPr>
+      </w:pPr>
+    </w:p>
+    <w:p>
+      <w:pPr>
         <w:pStyle w:val="Heading2"/>
-        <w:ind w:firstLineChars="50" w:firstLine="131"/>
-        <w:jc w:val="both"/>
-        <w:rPr>
-          <w:szCs w:val="26"/>
-        </w:rPr>
-      </w:pPr>
-      <w:bookmarkStart w:id="10" w:name="_Toc237628331"/>
+        <w:jc w:val="both"/>
+        <w:rPr>
+          <w:szCs w:val="26"/>
+        </w:rPr>
+      </w:pPr>
+      <w:bookmarkStart w:id="9" w:name="_Toc238059515"/>
       <w:r>
         <w:rPr>
           <w:szCs w:val="26"/>
@@ -4887,60 +5001,419 @@
         </w:rPr>
         <w:t xml:space="preserve"> Security &amp; Authorization Testing (Kiểm thử phân quyền 2 tầng)</w:t>
       </w:r>
+      <w:bookmarkEnd w:id="9"/>
+    </w:p>
+    <w:p>
+      <w:pPr>
+        <w:jc w:val="both"/>
+        <w:rPr>
+          <w:rFonts w:ascii="Times New Roman" w:hAnsi="Times New Roman" w:cs="Times New Roman"/>
+          <w:sz w:val="26"/>
+          <w:szCs w:val="26"/>
+        </w:rPr>
+      </w:pPr>
+      <w:r>
+        <w:rPr>
+          <w:rFonts w:ascii="Times New Roman" w:hAnsi="Times New Roman" w:cs="Times New Roman"/>
+          <w:sz w:val="26"/>
+          <w:szCs w:val="26"/>
+        </w:rPr>
+        <w:t xml:space="preserve">Tầng 1 (Spring Security Filter): Kiểm tra các đường dẫn bị chặn bằng 401 Unauthorized (chưa token) hoặc 403 Forbidden (sai Role). </w:t>
+      </w:r>
+    </w:p>
+    <w:p>
+      <w:pPr>
+        <w:jc w:val="both"/>
+        <w:rPr>
+          <w:rFonts w:ascii="Times New Roman" w:hAnsi="Times New Roman" w:cs="Times New Roman"/>
+          <w:sz w:val="26"/>
+          <w:szCs w:val="26"/>
+        </w:rPr>
+      </w:pPr>
+      <w:r>
+        <w:rPr>
+          <w:rFonts w:ascii="Times New Roman" w:hAnsi="Times New Roman" w:cs="Times New Roman"/>
+          <w:sz w:val="26"/>
+          <w:szCs w:val="26"/>
+        </w:rPr>
+        <w:t xml:space="preserve">Tầng 2 (Logic Controller): Kiểm tra các trường hợp vi phạm quyền sở hữu dữ liệu (Customer A cố truy cập/hủy đơn của Customer B -&gt; kỳ vọng 401 Unauthorized; Sửa profile khác email token -&gt; kỳ vọng 400 Bad Request). </w:t>
+      </w:r>
+    </w:p>
+    <w:p>
+      <w:pPr>
+        <w:jc w:val="both"/>
+        <w:rPr>
+          <w:rFonts w:ascii="Times New Roman" w:hAnsi="Times New Roman" w:cs="Times New Roman"/>
+          <w:sz w:val="26"/>
+          <w:szCs w:val="26"/>
+        </w:rPr>
+      </w:pPr>
+      <w:r>
+        <w:rPr>
+          <w:rFonts w:ascii="Times New Roman" w:hAnsi="Times New Roman" w:cs="Times New Roman"/>
+          <w:sz w:val="26"/>
+          <w:szCs w:val="26"/>
+        </w:rPr>
+        <w:t xml:space="preserve">Lỗ hổng bảo mật đặc biệt (Security Flaw): Kiểm thử case cố tình đăng ký tài khoản mang role: "ROLE_MANAGER" qua API /register để xác nhận và ghi nhận lỗi hệ thống cho phép chiếm quyền Manager. </w:t>
+      </w:r>
+    </w:p>
+    <w:p>
+      <w:pPr>
+        <w:jc w:val="both"/>
+        <w:rPr>
+          <w:rFonts w:ascii="Times New Roman" w:hAnsi="Times New Roman" w:cs="Times New Roman"/>
+          <w:sz w:val="26"/>
+          <w:szCs w:val="26"/>
+        </w:rPr>
+      </w:pPr>
+    </w:p>
+    <w:p>
+      <w:pPr>
+        <w:pStyle w:val="Heading2"/>
+        <w:jc w:val="both"/>
+        <w:rPr>
+          <w:szCs w:val="26"/>
+        </w:rPr>
+      </w:pPr>
+      <w:r>
+        <w:rPr>
+          <w:szCs w:val="26"/>
+        </w:rPr>
+        <w:t xml:space="preserve">3.6 </w:t>
+      </w:r>
+      <w:r>
+        <w:rPr>
+          <w:szCs w:val="26"/>
+        </w:rPr>
+        <w:t>White-box Testing</w:t>
+      </w:r>
+    </w:p>
+    <w:p>
+      <w:pPr>
+        <w:jc w:val="both"/>
+        <w:rPr>
+          <w:rFonts w:ascii="Times New Roman" w:hAnsi="Times New Roman" w:cs="Times New Roman"/>
+          <w:sz w:val="26"/>
+          <w:szCs w:val="26"/>
+        </w:rPr>
+      </w:pPr>
+      <w:r>
+        <w:rPr>
+          <w:rFonts w:ascii="Times New Roman" w:hAnsi="Times New Roman" w:cs="Times New Roman"/>
+          <w:sz w:val="26"/>
+          <w:szCs w:val="26"/>
+        </w:rPr>
+        <w:lastRenderedPageBreak/>
+        <w:t>Áp dụng State Transition Testing cho Order (NEW → FINISHED / CANCELED).</w:t>
+      </w:r>
+    </w:p>
+    <w:p>
+      <w:pPr>
+        <w:jc w:val="both"/>
+        <w:rPr>
+          <w:rFonts w:ascii="Times New Roman" w:hAnsi="Times New Roman" w:cs="Times New Roman"/>
+          <w:sz w:val="26"/>
+          <w:szCs w:val="26"/>
+        </w:rPr>
+      </w:pPr>
+      <w:r>
+        <w:rPr>
+          <w:rFonts w:ascii="Times New Roman" w:hAnsi="Times New Roman" w:cs="Times New Roman"/>
+          <w:sz w:val="26"/>
+          <w:szCs w:val="26"/>
+        </w:rPr>
+        <w:t>Decision Table cho phân quyền 2 tầng + validation form.</w:t>
+      </w:r>
+    </w:p>
+    <w:p>
+      <w:pPr>
+        <w:jc w:val="both"/>
+        <w:rPr>
+          <w:rFonts w:ascii="Times New Roman" w:hAnsi="Times New Roman" w:cs="Times New Roman"/>
+          <w:sz w:val="26"/>
+          <w:szCs w:val="26"/>
+        </w:rPr>
+      </w:pPr>
+      <w:r>
+        <w:rPr>
+          <w:rFonts w:ascii="Times New Roman" w:hAnsi="Times New Roman" w:cs="Times New Roman"/>
+          <w:sz w:val="26"/>
+          <w:szCs w:val="26"/>
+        </w:rPr>
+        <w:t>Đo Coverage Unit Test (JaCoCo) và báo cáo % Statement / Branch coverage.</w:t>
+      </w:r>
+    </w:p>
+    <w:p>
+      <w:pPr>
+        <w:jc w:val="both"/>
+        <w:rPr>
+          <w:rFonts w:ascii="Times New Roman" w:hAnsi="Times New Roman" w:cs="Times New Roman"/>
+          <w:sz w:val="26"/>
+          <w:szCs w:val="26"/>
+        </w:rPr>
+      </w:pPr>
+      <w:r>
+        <w:rPr>
+          <w:rFonts w:ascii="Times New Roman" w:hAnsi="Times New Roman" w:cs="Times New Roman"/>
+          <w:sz w:val="26"/>
+          <w:szCs w:val="26"/>
+        </w:rPr>
+        <w:t>Liên kết BVA đã viết với White-box (đường đi qua các nhánh if/validate).</w:t>
+      </w:r>
+    </w:p>
+    <w:p>
+      <w:pPr>
+        <w:jc w:val="both"/>
+        <w:rPr>
+          <w:rFonts w:ascii="Times New Roman" w:hAnsi="Times New Roman" w:cs="Times New Roman"/>
+          <w:sz w:val="26"/>
+          <w:szCs w:val="26"/>
+        </w:rPr>
+      </w:pPr>
+    </w:p>
+    <w:p>
+      <w:pPr>
+        <w:pStyle w:val="Heading1"/>
+        <w:jc w:val="both"/>
+        <w:rPr>
+          <w:szCs w:val="26"/>
+        </w:rPr>
+      </w:pPr>
+      <w:bookmarkStart w:id="10" w:name="_Toc238059516"/>
+      <w:r>
+        <w:rPr>
+          <w:szCs w:val="26"/>
+        </w:rPr>
+        <w:t>4. MÔI TRƯỜNG KIỂM THỬ &amp; QUY TRÌNH XỬ LÝ DỮ LIỆU</w:t>
+      </w:r>
       <w:bookmarkEnd w:id="10"/>
     </w:p>
     <w:p>
       <w:pPr>
-        <w:jc w:val="both"/>
-        <w:rPr>
-          <w:rFonts w:ascii="Times New Roman" w:hAnsi="Times New Roman" w:cs="Times New Roman"/>
-          <w:sz w:val="26"/>
-          <w:szCs w:val="26"/>
-        </w:rPr>
-      </w:pPr>
-      <w:r>
-        <w:rPr>
-          <w:rFonts w:ascii="Times New Roman" w:hAnsi="Times New Roman" w:cs="Times New Roman"/>
-          <w:sz w:val="26"/>
-          <w:szCs w:val="26"/>
-        </w:rPr>
-        <w:t xml:space="preserve">Tầng 1 (Spring Security Filter): Kiểm tra các đường dẫn bị chặn bằng 401 Unauthorized (chưa token) hoặc 403 Forbidden (sai Role). </w:t>
-      </w:r>
-    </w:p>
-    <w:p>
-      <w:pPr>
-        <w:jc w:val="both"/>
-        <w:rPr>
-          <w:rFonts w:ascii="Times New Roman" w:hAnsi="Times New Roman" w:cs="Times New Roman"/>
-          <w:sz w:val="26"/>
-          <w:szCs w:val="26"/>
-        </w:rPr>
-      </w:pPr>
-      <w:r>
-        <w:rPr>
-          <w:rFonts w:ascii="Times New Roman" w:hAnsi="Times New Roman" w:cs="Times New Roman"/>
-          <w:sz w:val="26"/>
-          <w:szCs w:val="26"/>
-        </w:rPr>
-        <w:t xml:space="preserve">Tầng 2 (Logic Controller): Kiểm tra các trường hợp vi phạm quyền sở hữu dữ liệu (Customer A cố truy cập/hủy đơn của Customer B -&gt; kỳ vọng 401 Unauthorized; Sửa profile khác email token -&gt; kỳ vọng 400 Bad Request). </w:t>
-      </w:r>
-    </w:p>
-    <w:p>
-      <w:pPr>
-        <w:jc w:val="both"/>
-        <w:rPr>
-          <w:rFonts w:ascii="Times New Roman" w:hAnsi="Times New Roman" w:cs="Times New Roman"/>
-          <w:sz w:val="26"/>
-          <w:szCs w:val="26"/>
-        </w:rPr>
-      </w:pPr>
-      <w:r>
-        <w:rPr>
-          <w:rFonts w:ascii="Times New Roman" w:hAnsi="Times New Roman" w:cs="Times New Roman"/>
-          <w:sz w:val="26"/>
-          <w:szCs w:val="26"/>
-        </w:rPr>
-        <w:t xml:space="preserve">Lỗ hổng bảo mật đặc biệt (Security Flaw): Kiểm thử case cố tình đăng ký tài khoản mang role: "ROLE_MANAGER" qua API /register để xác nhận và ghi nhận lỗi hệ thống cho phép chiếm quyền Manager. </w:t>
+        <w:pStyle w:val="Heading2"/>
+        <w:jc w:val="both"/>
+        <w:rPr>
+          <w:szCs w:val="26"/>
+        </w:rPr>
+      </w:pPr>
+      <w:bookmarkStart w:id="11" w:name="_Toc238059517"/>
+      <w:r>
+        <w:rPr>
+          <w:szCs w:val="26"/>
+        </w:rPr>
+        <w:t>4.1 Môi trường kiểm thử (Test Environment)</w:t>
+      </w:r>
+      <w:bookmarkEnd w:id="11"/>
+    </w:p>
+    <w:p>
+      <w:pPr>
+        <w:jc w:val="both"/>
+        <w:rPr>
+          <w:rFonts w:ascii="Times New Roman" w:hAnsi="Times New Roman" w:cs="Times New Roman"/>
+          <w:sz w:val="26"/>
+          <w:szCs w:val="26"/>
+        </w:rPr>
+      </w:pPr>
+      <w:r>
+        <w:rPr>
+          <w:rFonts w:ascii="Times New Roman" w:hAnsi="Times New Roman" w:cs="Times New Roman"/>
+          <w:sz w:val="26"/>
+          <w:szCs w:val="26"/>
+        </w:rPr>
+        <w:t>Frontend: Angular 7 chạy tại http://localhost:4200</w:t>
+      </w:r>
+    </w:p>
+    <w:p>
+      <w:pPr>
+        <w:jc w:val="both"/>
+        <w:rPr>
+          <w:rFonts w:ascii="Times New Roman" w:hAnsi="Times New Roman" w:cs="Times New Roman"/>
+          <w:sz w:val="26"/>
+          <w:szCs w:val="26"/>
+        </w:rPr>
+      </w:pPr>
+      <w:r>
+        <w:rPr>
+          <w:rFonts w:ascii="Times New Roman" w:hAnsi="Times New Roman" w:cs="Times New Roman"/>
+          <w:sz w:val="26"/>
+          <w:szCs w:val="26"/>
+        </w:rPr>
+        <w:t>Backend: Spring Boot 2.x (Java 8/11) chạy tại http://localhost:8080/api</w:t>
+      </w:r>
+    </w:p>
+    <w:p>
+      <w:pPr>
+        <w:jc w:val="both"/>
+        <w:rPr>
+          <w:rFonts w:ascii="Times New Roman" w:hAnsi="Times New Roman" w:cs="Times New Roman"/>
+          <w:sz w:val="26"/>
+          <w:szCs w:val="26"/>
+        </w:rPr>
+      </w:pPr>
+      <w:r>
+        <w:rPr>
+          <w:rFonts w:ascii="Times New Roman" w:hAnsi="Times New Roman" w:cs="Times New Roman"/>
+          <w:sz w:val="26"/>
+          <w:szCs w:val="26"/>
+        </w:rPr>
+        <w:t xml:space="preserve">Database: PostgreSQL chạy cục bộ (Port 5432, Database Name: shopping_store) </w:t>
+      </w:r>
+    </w:p>
+    <w:p>
+      <w:pPr>
+        <w:jc w:val="both"/>
+        <w:rPr>
+          <w:rFonts w:ascii="Times New Roman" w:hAnsi="Times New Roman" w:cs="Times New Roman"/>
+          <w:sz w:val="26"/>
+          <w:szCs w:val="26"/>
+        </w:rPr>
+      </w:pPr>
+      <w:r>
+        <w:rPr>
+          <w:rFonts w:ascii="Times New Roman" w:eastAsia="SimSun" w:hAnsi="Times New Roman" w:cs="Times New Roman"/>
+          <w:sz w:val="26"/>
+          <w:szCs w:val="26"/>
+        </w:rPr>
+        <w:t>Automation E2E: Bổ sung Node.js + CodeceptJS + Playwright.</w:t>
+      </w:r>
+    </w:p>
+    <w:p>
+      <w:pPr>
+        <w:jc w:val="both"/>
+        <w:rPr>
+          <w:rFonts w:ascii="Times New Roman" w:hAnsi="Times New Roman" w:cs="Times New Roman"/>
+          <w:sz w:val="26"/>
+          <w:szCs w:val="26"/>
+        </w:rPr>
+      </w:pPr>
+    </w:p>
+    <w:p>
+      <w:pPr>
+        <w:pStyle w:val="Heading2"/>
+        <w:jc w:val="both"/>
+        <w:rPr>
+          <w:szCs w:val="26"/>
+        </w:rPr>
+      </w:pPr>
+      <w:bookmarkStart w:id="12" w:name="_Toc238059518"/>
+      <w:r>
+        <w:rPr>
+          <w:szCs w:val="26"/>
+        </w:rPr>
+        <w:t>4.2 Quy trình Reset dữ liệu bắt buộc (Data Reset Protocol)</w:t>
+      </w:r>
+      <w:bookmarkEnd w:id="12"/>
+    </w:p>
+    <w:p>
+      <w:pPr>
+        <w:ind w:firstLine="720"/>
+        <w:jc w:val="both"/>
+        <w:rPr>
+          <w:rFonts w:ascii="Times New Roman" w:hAnsi="Times New Roman" w:cs="Times New Roman"/>
+          <w:sz w:val="26"/>
+          <w:szCs w:val="26"/>
+        </w:rPr>
+      </w:pPr>
+      <w:r>
+        <w:rPr>
+          <w:rFonts w:ascii="Times New Roman" w:hAnsi="Times New Roman" w:cs="Times New Roman"/>
+          <w:sz w:val="26"/>
+          <w:szCs w:val="26"/>
+        </w:rPr>
+        <w:t xml:space="preserve">Do Backend cấu hình Hibernate dạng spring.jpa.hibernate.ddl-auto=create, mỗi khi ứng dụng Spring Boot khởi động lại, Database sẽ bị xóa toàn bộ và tự động nạp lại dữ liệu khởi tạo từ file import.sql. </w:t>
+      </w:r>
+    </w:p>
+    <w:p>
+      <w:pPr>
+        <w:jc w:val="both"/>
+        <w:rPr>
+          <w:rFonts w:ascii="Times New Roman" w:hAnsi="Times New Roman" w:cs="Times New Roman"/>
+          <w:sz w:val="26"/>
+          <w:szCs w:val="26"/>
+        </w:rPr>
+      </w:pPr>
+      <w:r>
+        <w:rPr>
+          <w:rFonts w:ascii="Times New Roman" w:hAnsi="Times New Roman" w:cs="Times New Roman"/>
+          <w:sz w:val="26"/>
+          <w:szCs w:val="26"/>
+        </w:rPr>
+        <w:t>Quy trình quan trọng khi test order:</w:t>
+      </w:r>
+    </w:p>
+    <w:p>
+      <w:pPr>
+        <w:ind w:firstLine="720"/>
+        <w:jc w:val="both"/>
+        <w:rPr>
+          <w:rFonts w:ascii="Times New Roman" w:hAnsi="Times New Roman" w:cs="Times New Roman"/>
+          <w:sz w:val="26"/>
+          <w:szCs w:val="26"/>
+        </w:rPr>
+      </w:pPr>
+      <w:r>
+        <w:rPr>
+          <w:rFonts w:ascii="Times New Roman" w:hAnsi="Times New Roman" w:cs="Times New Roman"/>
+          <w:sz w:val="26"/>
+          <w:szCs w:val="26"/>
+        </w:rPr>
+        <w:t xml:space="preserve">Các thao tác Hủy đơn (PATCH /order/cancel/{id}) và Xác nhận đơn (PATCH /order/finish/{id}) làm thay đổi vĩnh viễn trạng thái đơn hàng từ 0 (New) sang 1 (Completed) hoặc 2 (Canceled). </w:t>
+      </w:r>
+    </w:p>
+    <w:p>
+      <w:pPr>
+        <w:jc w:val="both"/>
+        <w:rPr>
+          <w:rFonts w:ascii="Times New Roman" w:hAnsi="Times New Roman" w:cs="Times New Roman"/>
+          <w:sz w:val="26"/>
+          <w:szCs w:val="26"/>
+        </w:rPr>
+      </w:pPr>
+      <w:r>
+        <w:rPr>
+          <w:rFonts w:ascii="Times New Roman" w:hAnsi="Times New Roman" w:cs="Times New Roman"/>
+          <w:sz w:val="26"/>
+          <w:szCs w:val="26"/>
+        </w:rPr>
+        <w:t>Yêu cầu đối với Tester:</w:t>
+      </w:r>
+    </w:p>
+    <w:p>
+      <w:pPr>
+        <w:ind w:firstLine="720"/>
+        <w:jc w:val="both"/>
+        <w:rPr>
+          <w:rFonts w:ascii="Times New Roman" w:hAnsi="Times New Roman" w:cs="Times New Roman"/>
+          <w:sz w:val="26"/>
+          <w:szCs w:val="26"/>
+        </w:rPr>
+      </w:pPr>
+      <w:r>
+        <w:rPr>
+          <w:rFonts w:ascii="Times New Roman" w:hAnsi="Times New Roman" w:cs="Times New Roman"/>
+          <w:sz w:val="26"/>
+          <w:szCs w:val="26"/>
+        </w:rPr>
+        <w:t xml:space="preserve">Trước MỖI VÒNG CHẠY TEST SUITE (bằng Postman Runner, Newman, hoặc Manual Test luồng Order), Tester BẮT BUỘC phải Stop và Re-run (Restart) Server Backend trong IntelliJ. </w:t>
+      </w:r>
+    </w:p>
+    <w:p>
+      <w:pPr>
+        <w:ind w:firstLine="720"/>
+        <w:jc w:val="both"/>
+        <w:rPr>
+          <w:rFonts w:ascii="Times New Roman" w:hAnsi="Times New Roman" w:cs="Times New Roman"/>
+          <w:sz w:val="26"/>
+          <w:szCs w:val="26"/>
+        </w:rPr>
+      </w:pPr>
+      <w:r>
+        <w:rPr>
+          <w:rFonts w:ascii="Times New Roman" w:hAnsi="Times New Roman" w:cs="Times New Roman"/>
+          <w:sz w:val="26"/>
+          <w:szCs w:val="26"/>
+        </w:rPr>
+        <w:t>Việc này đảm bảo các orderId mẫu (2147483643, 2147483645, 2147483649...) được khôi phục về trạng thái ban đầu (orderStatus = 0), tránh việc test case bị FAIL hãnh tiến do dữ liệu đã bị biến đổi ở lần test trước.</w:t>
       </w:r>
     </w:p>
     <w:p>
@@ -4961,14 +5434,15 @@
           <w:szCs w:val="26"/>
         </w:rPr>
       </w:pPr>
-      <w:bookmarkStart w:id="11" w:name="_Toc237628332"/>
-      <w:r>
-        <w:rPr>
-          <w:szCs w:val="26"/>
-        </w:rPr>
-        <w:t>4. MÔI TRƯỜNG KIỂM THỬ &amp; QUY TRÌNH XỬ LÝ DỮ LIỆU</w:t>
-      </w:r>
-      <w:bookmarkEnd w:id="11"/>
+      <w:bookmarkStart w:id="13" w:name="_Toc238059519"/>
+      <w:r>
+        <w:rPr>
+          <w:szCs w:val="26"/>
+        </w:rPr>
+        <w:lastRenderedPageBreak/>
+        <w:t>5. TIÊU CHÍ KIỂM THỬ (Test Criteria)</w:t>
+      </w:r>
+      <w:bookmarkEnd w:id="13"/>
     </w:p>
     <w:p>
       <w:pPr>
@@ -4978,86 +5452,70 @@
           <w:szCs w:val="26"/>
         </w:rPr>
       </w:pPr>
-      <w:bookmarkStart w:id="12" w:name="_Toc237628333"/>
-      <w:r>
-        <w:rPr>
-          <w:szCs w:val="26"/>
-        </w:rPr>
-        <w:t>4.1 Môi trường kiểm thử (Test Environment)</w:t>
-      </w:r>
-      <w:bookmarkEnd w:id="12"/>
-    </w:p>
-    <w:p>
-      <w:pPr>
-        <w:jc w:val="both"/>
-        <w:rPr>
-          <w:rFonts w:ascii="Times New Roman" w:hAnsi="Times New Roman" w:cs="Times New Roman"/>
-          <w:sz w:val="26"/>
-          <w:szCs w:val="26"/>
-        </w:rPr>
-      </w:pPr>
-      <w:r>
-        <w:rPr>
-          <w:rFonts w:ascii="Times New Roman" w:hAnsi="Times New Roman" w:cs="Times New Roman"/>
-          <w:sz w:val="26"/>
-          <w:szCs w:val="26"/>
-        </w:rPr>
-        <w:t>Frontend: Angular 7 chạy tại http://localhost:4200</w:t>
-      </w:r>
-    </w:p>
-    <w:p>
-      <w:pPr>
-        <w:jc w:val="both"/>
-        <w:rPr>
-          <w:rFonts w:ascii="Times New Roman" w:hAnsi="Times New Roman" w:cs="Times New Roman"/>
-          <w:sz w:val="26"/>
-          <w:szCs w:val="26"/>
-        </w:rPr>
-      </w:pPr>
-      <w:r>
-        <w:rPr>
-          <w:rFonts w:ascii="Times New Roman" w:hAnsi="Times New Roman" w:cs="Times New Roman"/>
-          <w:sz w:val="26"/>
-          <w:szCs w:val="26"/>
-        </w:rPr>
-        <w:t>Backend: Spring Boot 2.x (Java 8/11) chạy tại http://localhost:8080/api</w:t>
-      </w:r>
-    </w:p>
-    <w:p>
-      <w:pPr>
-        <w:jc w:val="both"/>
-        <w:rPr>
-          <w:rFonts w:ascii="Times New Roman" w:hAnsi="Times New Roman" w:cs="Times New Roman"/>
-          <w:sz w:val="26"/>
-          <w:szCs w:val="26"/>
-        </w:rPr>
-      </w:pPr>
-      <w:r>
-        <w:rPr>
-          <w:rFonts w:ascii="Times New Roman" w:hAnsi="Times New Roman" w:cs="Times New Roman"/>
-          <w:sz w:val="26"/>
-          <w:szCs w:val="26"/>
-        </w:rPr>
-        <w:t xml:space="preserve">Database: PostgreSQL chạy cục bộ (Port 5432, Database Name: shopping_store) </w:t>
-      </w:r>
-    </w:p>
-    <w:p>
-      <w:pPr>
-        <w:jc w:val="both"/>
-        <w:rPr>
-          <w:rFonts w:ascii="Times New Roman" w:hAnsi="Times New Roman" w:cs="Times New Roman"/>
-          <w:sz w:val="26"/>
-          <w:szCs w:val="26"/>
-        </w:rPr>
-      </w:pPr>
-      <w:r>
-        <w:rPr>
-          <w:rFonts w:ascii="Times New Roman" w:eastAsia="SimSun" w:hAnsi="Times New Roman" w:cs="Times New Roman"/>
-          <w:sz w:val="26"/>
-          <w:szCs w:val="26"/>
-        </w:rPr>
-        <w:lastRenderedPageBreak/>
-        <w:t>Automation E2E: Bổ sung Node.js + CodeceptJS + Playwright.</w:t>
+      <w:bookmarkStart w:id="14" w:name="_Toc238059520"/>
+      <w:r>
+        <w:rPr>
+          <w:szCs w:val="26"/>
+        </w:rPr>
+        <w:t>5.1 Tiêu chí bắt đầu (Entry Criteria)</w:t>
+      </w:r>
+      <w:bookmarkEnd w:id="14"/>
+    </w:p>
+    <w:p>
+      <w:pPr>
+        <w:ind w:firstLine="720"/>
+        <w:jc w:val="both"/>
+        <w:rPr>
+          <w:rFonts w:ascii="Times New Roman" w:hAnsi="Times New Roman" w:cs="Times New Roman"/>
+          <w:sz w:val="26"/>
+          <w:szCs w:val="26"/>
+        </w:rPr>
+      </w:pPr>
+      <w:r>
+        <w:rPr>
+          <w:rFonts w:ascii="Times New Roman" w:hAnsi="Times New Roman" w:cs="Times New Roman"/>
+          <w:sz w:val="26"/>
+          <w:szCs w:val="26"/>
+        </w:rPr>
+        <w:t xml:space="preserve">Source code Backend và Frontend build thành công trên máy local, không có lỗi biên dịch. </w:t>
+      </w:r>
+    </w:p>
+    <w:p>
+      <w:pPr>
+        <w:ind w:firstLine="720"/>
+        <w:jc w:val="both"/>
+        <w:rPr>
+          <w:rFonts w:ascii="Times New Roman" w:hAnsi="Times New Roman" w:cs="Times New Roman"/>
+          <w:sz w:val="26"/>
+          <w:szCs w:val="26"/>
+        </w:rPr>
+      </w:pPr>
+      <w:r>
+        <w:rPr>
+          <w:rFonts w:ascii="Times New Roman" w:hAnsi="Times New Roman" w:cs="Times New Roman"/>
+          <w:sz w:val="26"/>
+          <w:szCs w:val="26"/>
+        </w:rPr>
+        <w:t xml:space="preserve">Database PostgreSQL khởi chạy ổn định và nạp thành công dữ liệu từ import.sql. </w:t>
+      </w:r>
+    </w:p>
+    <w:p>
+      <w:pPr>
+        <w:ind w:firstLine="720"/>
+        <w:jc w:val="both"/>
+        <w:rPr>
+          <w:rFonts w:ascii="Times New Roman" w:hAnsi="Times New Roman" w:cs="Times New Roman"/>
+          <w:sz w:val="26"/>
+          <w:szCs w:val="26"/>
+        </w:rPr>
+      </w:pPr>
+      <w:r>
+        <w:rPr>
+          <w:rFonts w:ascii="Times New Roman" w:hAnsi="Times New Roman" w:cs="Times New Roman"/>
+          <w:sz w:val="26"/>
+          <w:szCs w:val="26"/>
+        </w:rPr>
+        <w:t>Bộ tài liệu API_Spec.md và Postman Collection đã sẵn sàng.</w:t>
       </w:r>
     </w:p>
     <w:p>
@@ -5078,14 +5536,14 @@
           <w:szCs w:val="26"/>
         </w:rPr>
       </w:pPr>
-      <w:bookmarkStart w:id="13" w:name="_Toc237628334"/>
-      <w:r>
-        <w:rPr>
-          <w:szCs w:val="26"/>
-        </w:rPr>
-        <w:t>4.2 Quy trình Reset dữ liệu bắt buộc (Data Reset Protocol)</w:t>
-      </w:r>
-      <w:bookmarkEnd w:id="13"/>
+      <w:bookmarkStart w:id="15" w:name="_Toc238059521"/>
+      <w:r>
+        <w:rPr>
+          <w:szCs w:val="26"/>
+        </w:rPr>
+        <w:t>5.2 Tiêu chí tạm dừng &amp; Bắt đầu lại (Suspension &amp; Resumption Criteria)</w:t>
+      </w:r>
+      <w:bookmarkEnd w:id="15"/>
     </w:p>
     <w:p>
       <w:pPr>
@@ -5103,25 +5561,7 @@
           <w:sz w:val="26"/>
           <w:szCs w:val="26"/>
         </w:rPr>
-        <w:t xml:space="preserve">Do Backend cấu hình Hibernate dạng spring.jpa.hibernate.ddl-auto=create, mỗi khi ứng dụng Spring Boot khởi động lại, Database sẽ bị xóa toàn bộ và tự động nạp lại dữ liệu khởi tạo từ file import.sql. </w:t>
-      </w:r>
-    </w:p>
-    <w:p>
-      <w:pPr>
-        <w:jc w:val="both"/>
-        <w:rPr>
-          <w:rFonts w:ascii="Times New Roman" w:hAnsi="Times New Roman" w:cs="Times New Roman"/>
-          <w:sz w:val="26"/>
-          <w:szCs w:val="26"/>
-        </w:rPr>
-      </w:pPr>
-      <w:r>
-        <w:rPr>
-          <w:rFonts w:ascii="Times New Roman" w:hAnsi="Times New Roman" w:cs="Times New Roman"/>
-          <w:sz w:val="26"/>
-          <w:szCs w:val="26"/>
-        </w:rPr>
-        <w:t>Quy trình quan trọng khi test order:</w:t>
+        <w:t xml:space="preserve">Tạm dừng: Khi xuất hiện lỗi Blocker (máy chủ Backend không thể khởi động, Database bị nổ kết nối, hoặc API /login bị lỗi 500 toàn bộ). </w:t>
       </w:r>
     </w:p>
     <w:p>
@@ -5140,26 +5580,35 @@
           <w:sz w:val="26"/>
           <w:szCs w:val="26"/>
         </w:rPr>
-        <w:t xml:space="preserve">Các thao tác Hủy đơn (PATCH /order/cancel/{id}) và Xác nhận đơn (PATCH /order/finish/{id}) làm thay đổi vĩnh viễn trạng thái đơn hàng từ 0 (New) sang 1 (Completed) hoặc 2 (Canceled). </w:t>
-      </w:r>
-    </w:p>
-    <w:p>
-      <w:pPr>
-        <w:jc w:val="both"/>
-        <w:rPr>
-          <w:rFonts w:ascii="Times New Roman" w:hAnsi="Times New Roman" w:cs="Times New Roman"/>
-          <w:sz w:val="26"/>
-          <w:szCs w:val="26"/>
-        </w:rPr>
-      </w:pPr>
-      <w:r>
-        <w:rPr>
-          <w:rFonts w:ascii="Times New Roman" w:hAnsi="Times New Roman" w:cs="Times New Roman"/>
-          <w:sz w:val="26"/>
-          <w:szCs w:val="26"/>
-        </w:rPr>
-        <w:t>Yêu cầu đối với Tester:</w:t>
-      </w:r>
+        <w:t xml:space="preserve">Bắt đầu lại: Khi khắc phục xong sự cố môi trường/Blocker bug và hệ thống sẵn sàng test tiếp. </w:t>
+      </w:r>
+    </w:p>
+    <w:p>
+      <w:pPr>
+        <w:jc w:val="both"/>
+        <w:rPr>
+          <w:rFonts w:ascii="Times New Roman" w:hAnsi="Times New Roman" w:cs="Times New Roman"/>
+          <w:sz w:val="26"/>
+          <w:szCs w:val="26"/>
+        </w:rPr>
+      </w:pPr>
+    </w:p>
+    <w:p>
+      <w:pPr>
+        <w:pStyle w:val="Heading2"/>
+        <w:jc w:val="both"/>
+        <w:rPr>
+          <w:szCs w:val="26"/>
+        </w:rPr>
+      </w:pPr>
+      <w:bookmarkStart w:id="16" w:name="_Toc238059522"/>
+      <w:r>
+        <w:rPr>
+          <w:szCs w:val="26"/>
+        </w:rPr>
+        <w:t>5.3 Tiêu chí kết thúc (Exit Criteria)</w:t>
+      </w:r>
+      <w:bookmarkEnd w:id="16"/>
     </w:p>
     <w:p>
       <w:pPr>
@@ -5177,7 +5626,7 @@
           <w:sz w:val="26"/>
           <w:szCs w:val="26"/>
         </w:rPr>
-        <w:t xml:space="preserve">Trước MỖI VÒNG CHẠY TEST SUITE (bằng Postman Runner, Newman, hoặc Manual Test luồng Order), Tester BẮT BUỘC phải Stop và Re-run (Restart) Server Backend trong IntelliJ. </w:t>
+        <w:t xml:space="preserve">100% các Test Case trong kế hoạch (FE Manual + API Automation + Unit Test) được thực thi đầy đủ. </w:t>
       </w:r>
     </w:p>
     <w:p>
@@ -5196,7 +5645,64 @@
           <w:sz w:val="26"/>
           <w:szCs w:val="26"/>
         </w:rPr>
-        <w:t>Việc này đảm bảo các orderId mẫu (2147483643, 2147483645, 2147483649...) được khôi phục về trạng thái ban đầu (orderStatus = 0), tránh việc test case bị FAIL hãnh tiến do dữ liệu đã bị biến đổi ở lần test trước.</w:t>
+        <w:t>100% các lỗi phát hiện (bao gồm lỗi Critical / Blocker) được ghi nhận đầy đủ vào Bug_Report.xlsx / Jira kèm phân tích nguyên nhân và đề xuất hướng xử lý (không bắt buộc khắc phục mã nguồn trong phạm vi kiểm thử của đồ án).</w:t>
+      </w:r>
+    </w:p>
+    <w:p>
+      <w:pPr>
+        <w:ind w:firstLine="720"/>
+        <w:jc w:val="both"/>
+        <w:rPr>
+          <w:rFonts w:ascii="Times New Roman" w:hAnsi="Times New Roman" w:cs="Times New Roman"/>
+          <w:sz w:val="26"/>
+          <w:szCs w:val="26"/>
+        </w:rPr>
+      </w:pPr>
+      <w:r>
+        <w:rPr>
+          <w:rFonts w:ascii="Times New Roman" w:hAnsi="Times New Roman" w:cs="Times New Roman"/>
+          <w:sz w:val="26"/>
+          <w:szCs w:val="26"/>
+        </w:rPr>
+        <w:t xml:space="preserve">Tỷ lệ thực thi và ghi nhận kết quả Test Case đạt 100%. </w:t>
+      </w:r>
+    </w:p>
+    <w:p>
+      <w:pPr>
+        <w:ind w:firstLine="720"/>
+        <w:jc w:val="both"/>
+        <w:rPr>
+          <w:rFonts w:ascii="Times New Roman" w:hAnsi="Times New Roman" w:cs="Times New Roman"/>
+          <w:sz w:val="26"/>
+          <w:szCs w:val="26"/>
+        </w:rPr>
+      </w:pPr>
+      <w:r>
+        <w:rPr>
+          <w:rFonts w:ascii="Times New Roman" w:hAnsi="Times New Roman" w:cs="Times New Roman"/>
+          <w:sz w:val="26"/>
+          <w:szCs w:val="26"/>
+        </w:rPr>
+        <w:t xml:space="preserve">Mọi bug tìm thấy đều được phân loại độ nghiêm trọng, log đầy đủ thông tin và dán vết vào ma trận RTM.xlsx. </w:t>
+      </w:r>
+    </w:p>
+    <w:p>
+      <w:pPr>
+        <w:ind w:firstLine="720"/>
+        <w:jc w:val="both"/>
+        <w:rPr>
+          <w:rFonts w:ascii="Times New Roman" w:hAnsi="Times New Roman" w:cs="Times New Roman"/>
+          <w:sz w:val="26"/>
+          <w:szCs w:val="26"/>
+        </w:rPr>
+      </w:pPr>
+      <w:r>
+        <w:rPr>
+          <w:rFonts w:ascii="Times New Roman" w:hAnsi="Times New Roman" w:cs="Times New Roman"/>
+          <w:sz w:val="26"/>
+          <w:szCs w:val="26"/>
+        </w:rPr>
+        <w:t>Unit Test phần Service layer do E đảm nhiệm đạt độ bao phủ (Code Coverage) &gt;=70%</w:t>
       </w:r>
     </w:p>
     <w:p>
@@ -5212,301 +5718,12 @@
     <w:p>
       <w:pPr>
         <w:pStyle w:val="Heading1"/>
-        <w:jc w:val="both"/>
-        <w:rPr>
-          <w:szCs w:val="26"/>
-        </w:rPr>
-      </w:pPr>
-      <w:bookmarkStart w:id="14" w:name="_Toc237628335"/>
-      <w:r>
-        <w:rPr>
-          <w:szCs w:val="26"/>
-        </w:rPr>
-        <w:t>5. TIÊU CHÍ KIỂM THỬ (Test Criteria)</w:t>
-      </w:r>
-      <w:bookmarkEnd w:id="14"/>
-    </w:p>
-    <w:p>
-      <w:pPr>
-        <w:pStyle w:val="Heading2"/>
-        <w:jc w:val="both"/>
-        <w:rPr>
-          <w:szCs w:val="26"/>
-        </w:rPr>
-      </w:pPr>
-      <w:bookmarkStart w:id="15" w:name="_Toc237628336"/>
-      <w:r>
-        <w:rPr>
-          <w:szCs w:val="26"/>
-        </w:rPr>
-        <w:t>5.1 Tiêu chí bắt đầu (Entry Criteria)</w:t>
-      </w:r>
-      <w:bookmarkEnd w:id="15"/>
-    </w:p>
-    <w:p>
-      <w:pPr>
-        <w:ind w:firstLine="720"/>
-        <w:jc w:val="both"/>
-        <w:rPr>
-          <w:rFonts w:ascii="Times New Roman" w:hAnsi="Times New Roman" w:cs="Times New Roman"/>
-          <w:sz w:val="26"/>
-          <w:szCs w:val="26"/>
-        </w:rPr>
-      </w:pPr>
-      <w:r>
-        <w:rPr>
-          <w:rFonts w:ascii="Times New Roman" w:hAnsi="Times New Roman" w:cs="Times New Roman"/>
-          <w:sz w:val="26"/>
-          <w:szCs w:val="26"/>
-        </w:rPr>
-        <w:t xml:space="preserve">Source code Backend và Frontend build thành công trên máy local, không có lỗi biên dịch. </w:t>
-      </w:r>
-    </w:p>
-    <w:p>
-      <w:pPr>
-        <w:ind w:firstLine="720"/>
-        <w:jc w:val="both"/>
-        <w:rPr>
-          <w:rFonts w:ascii="Times New Roman" w:hAnsi="Times New Roman" w:cs="Times New Roman"/>
-          <w:sz w:val="26"/>
-          <w:szCs w:val="26"/>
-        </w:rPr>
-      </w:pPr>
-      <w:r>
-        <w:rPr>
-          <w:rFonts w:ascii="Times New Roman" w:hAnsi="Times New Roman" w:cs="Times New Roman"/>
-          <w:sz w:val="26"/>
-          <w:szCs w:val="26"/>
-        </w:rPr>
-        <w:t xml:space="preserve">Database PostgreSQL khởi chạy ổn định và nạp thành công dữ liệu từ import.sql. </w:t>
-      </w:r>
-    </w:p>
-    <w:p>
-      <w:pPr>
-        <w:ind w:firstLine="720"/>
-        <w:jc w:val="both"/>
-        <w:rPr>
-          <w:rFonts w:ascii="Times New Roman" w:hAnsi="Times New Roman" w:cs="Times New Roman"/>
-          <w:sz w:val="26"/>
-          <w:szCs w:val="26"/>
-        </w:rPr>
-      </w:pPr>
-      <w:r>
-        <w:rPr>
-          <w:rFonts w:ascii="Times New Roman" w:hAnsi="Times New Roman" w:cs="Times New Roman"/>
-          <w:sz w:val="26"/>
-          <w:szCs w:val="26"/>
-        </w:rPr>
-        <w:t>Bộ tài liệu API_Spec.md và Postman Collection đã sẵn sàng.</w:t>
-      </w:r>
-    </w:p>
-    <w:p>
-      <w:pPr>
-        <w:jc w:val="both"/>
-        <w:rPr>
-          <w:rFonts w:ascii="Times New Roman" w:hAnsi="Times New Roman" w:cs="Times New Roman"/>
-          <w:sz w:val="26"/>
-          <w:szCs w:val="26"/>
-        </w:rPr>
-      </w:pPr>
-    </w:p>
-    <w:p>
-      <w:pPr>
-        <w:pStyle w:val="Heading2"/>
-        <w:jc w:val="both"/>
-        <w:rPr>
-          <w:szCs w:val="26"/>
-        </w:rPr>
-      </w:pPr>
-      <w:bookmarkStart w:id="16" w:name="_Toc237628337"/>
-      <w:r>
-        <w:rPr>
-          <w:szCs w:val="26"/>
-        </w:rPr>
-        <w:t>5.2 Tiêu chí tạm dừng &amp; Bắt đầu lại (Suspension &amp; Resumption Criteria)</w:t>
-      </w:r>
-      <w:bookmarkEnd w:id="16"/>
-    </w:p>
-    <w:p>
-      <w:pPr>
-        <w:ind w:firstLine="720"/>
-        <w:jc w:val="both"/>
-        <w:rPr>
-          <w:rFonts w:ascii="Times New Roman" w:hAnsi="Times New Roman" w:cs="Times New Roman"/>
-          <w:sz w:val="26"/>
-          <w:szCs w:val="26"/>
-        </w:rPr>
-      </w:pPr>
-      <w:r>
-        <w:rPr>
-          <w:rFonts w:ascii="Times New Roman" w:hAnsi="Times New Roman" w:cs="Times New Roman"/>
-          <w:sz w:val="26"/>
-          <w:szCs w:val="26"/>
-        </w:rPr>
-        <w:t xml:space="preserve">Tạm dừng: Khi xuất hiện lỗi Blocker (máy chủ Backend không thể khởi động, Database bị nổ kết nối, hoặc API /login bị lỗi 500 toàn bộ). </w:t>
-      </w:r>
-    </w:p>
-    <w:p>
-      <w:pPr>
-        <w:ind w:firstLine="720"/>
-        <w:jc w:val="both"/>
-        <w:rPr>
-          <w:rFonts w:ascii="Times New Roman" w:hAnsi="Times New Roman" w:cs="Times New Roman"/>
-          <w:sz w:val="26"/>
-          <w:szCs w:val="26"/>
-        </w:rPr>
-      </w:pPr>
-      <w:r>
-        <w:rPr>
-          <w:rFonts w:ascii="Times New Roman" w:hAnsi="Times New Roman" w:cs="Times New Roman"/>
-          <w:sz w:val="26"/>
-          <w:szCs w:val="26"/>
-        </w:rPr>
-        <w:lastRenderedPageBreak/>
-        <w:t xml:space="preserve">Bắt đầu lại: Khi khắc phục xong sự cố môi trường/Blocker bug và hệ thống sẵn sàng test tiếp. </w:t>
-      </w:r>
-    </w:p>
-    <w:p>
-      <w:pPr>
-        <w:jc w:val="both"/>
-        <w:rPr>
-          <w:rFonts w:ascii="Times New Roman" w:hAnsi="Times New Roman" w:cs="Times New Roman"/>
-          <w:sz w:val="26"/>
-          <w:szCs w:val="26"/>
-        </w:rPr>
-      </w:pPr>
-    </w:p>
-    <w:p>
-      <w:pPr>
-        <w:pStyle w:val="Heading2"/>
-        <w:jc w:val="both"/>
-        <w:rPr>
-          <w:szCs w:val="26"/>
-        </w:rPr>
-      </w:pPr>
-      <w:bookmarkStart w:id="17" w:name="_Toc237628338"/>
-      <w:r>
-        <w:rPr>
-          <w:szCs w:val="26"/>
-        </w:rPr>
-        <w:t>5.3 Tiêu chí kết thúc (Exit Criteria)</w:t>
+      </w:pPr>
+      <w:bookmarkStart w:id="17" w:name="_Toc238059523"/>
+      <w:r>
+        <w:t>6. KẾ HOẠCH &amp; LỊCH TRÌNH THỰC THI (Execution Schedule &amp; Allocation)</w:t>
       </w:r>
       <w:bookmarkEnd w:id="17"/>
-    </w:p>
-    <w:p>
-      <w:pPr>
-        <w:ind w:firstLine="720"/>
-        <w:jc w:val="both"/>
-        <w:rPr>
-          <w:rFonts w:ascii="Times New Roman" w:hAnsi="Times New Roman" w:cs="Times New Roman"/>
-          <w:sz w:val="26"/>
-          <w:szCs w:val="26"/>
-        </w:rPr>
-      </w:pPr>
-      <w:r>
-        <w:rPr>
-          <w:rFonts w:ascii="Times New Roman" w:hAnsi="Times New Roman" w:cs="Times New Roman"/>
-          <w:sz w:val="26"/>
-          <w:szCs w:val="26"/>
-        </w:rPr>
-        <w:t xml:space="preserve">100% các Test Case trong kế hoạch (FE Manual + API Automation + Unit Test) được thực thi đầy đủ. </w:t>
-      </w:r>
-    </w:p>
-    <w:p>
-      <w:pPr>
-        <w:ind w:firstLine="720"/>
-        <w:jc w:val="both"/>
-        <w:rPr>
-          <w:rFonts w:ascii="Times New Roman" w:hAnsi="Times New Roman" w:cs="Times New Roman"/>
-          <w:sz w:val="26"/>
-          <w:szCs w:val="26"/>
-        </w:rPr>
-      </w:pPr>
-      <w:r>
-        <w:rPr>
-          <w:rFonts w:ascii="Times New Roman" w:hAnsi="Times New Roman" w:cs="Times New Roman"/>
-          <w:sz w:val="26"/>
-          <w:szCs w:val="26"/>
-        </w:rPr>
-        <w:t>100% các lỗi phát hiện (bao gồm lỗi Critical / Blocker) được ghi nhận đầy đủ vào Bug_Report.xlsx / Jira kèm phân tích nguyên nhân và đề xuất hướng xử lý (không bắt buộc khắc phục mã nguồn trong phạm vi kiểm thử của đồ án).</w:t>
-      </w:r>
-    </w:p>
-    <w:p>
-      <w:pPr>
-        <w:ind w:firstLine="720"/>
-        <w:jc w:val="both"/>
-        <w:rPr>
-          <w:rFonts w:ascii="Times New Roman" w:hAnsi="Times New Roman" w:cs="Times New Roman"/>
-          <w:sz w:val="26"/>
-          <w:szCs w:val="26"/>
-        </w:rPr>
-      </w:pPr>
-      <w:r>
-        <w:rPr>
-          <w:rFonts w:ascii="Times New Roman" w:hAnsi="Times New Roman" w:cs="Times New Roman"/>
-          <w:sz w:val="26"/>
-          <w:szCs w:val="26"/>
-        </w:rPr>
-        <w:t xml:space="preserve">Tỷ lệ thực thi và ghi nhận kết quả Test Case đạt 100%. </w:t>
-      </w:r>
-    </w:p>
-    <w:p>
-      <w:pPr>
-        <w:ind w:firstLine="720"/>
-        <w:jc w:val="both"/>
-        <w:rPr>
-          <w:rFonts w:ascii="Times New Roman" w:hAnsi="Times New Roman" w:cs="Times New Roman"/>
-          <w:sz w:val="26"/>
-          <w:szCs w:val="26"/>
-        </w:rPr>
-      </w:pPr>
-      <w:r>
-        <w:rPr>
-          <w:rFonts w:ascii="Times New Roman" w:hAnsi="Times New Roman" w:cs="Times New Roman"/>
-          <w:sz w:val="26"/>
-          <w:szCs w:val="26"/>
-        </w:rPr>
-        <w:t xml:space="preserve">Mọi bug tìm thấy đều được phân loại độ nghiêm trọng, log đầy đủ thông tin và dán vết vào ma trận RTM.xlsx. </w:t>
-      </w:r>
-    </w:p>
-    <w:p>
-      <w:pPr>
-        <w:ind w:firstLine="720"/>
-        <w:jc w:val="both"/>
-        <w:rPr>
-          <w:rFonts w:ascii="Times New Roman" w:hAnsi="Times New Roman" w:cs="Times New Roman"/>
-          <w:sz w:val="26"/>
-          <w:szCs w:val="26"/>
-        </w:rPr>
-      </w:pPr>
-      <w:r>
-        <w:rPr>
-          <w:rFonts w:ascii="Times New Roman" w:hAnsi="Times New Roman" w:cs="Times New Roman"/>
-          <w:sz w:val="26"/>
-          <w:szCs w:val="26"/>
-        </w:rPr>
-        <w:t>Unit Test phần Service layer do E đảm nhiệm đạt độ bao phủ (Code Coverage) &gt;=70%</w:t>
-      </w:r>
-    </w:p>
-    <w:p>
-      <w:pPr>
-        <w:jc w:val="both"/>
-        <w:rPr>
-          <w:rFonts w:ascii="Times New Roman" w:hAnsi="Times New Roman" w:cs="Times New Roman"/>
-          <w:sz w:val="26"/>
-          <w:szCs w:val="26"/>
-        </w:rPr>
-      </w:pPr>
-    </w:p>
-    <w:p>
-      <w:pPr>
-        <w:pStyle w:val="Heading1"/>
-      </w:pPr>
-      <w:bookmarkStart w:id="18" w:name="_Toc237628339"/>
-      <w:r>
-        <w:t>6. KẾ HOẠCH &amp; LỊCH TRÌNH THỰC THI (Execution Schedule &amp; Allocation)</w:t>
-      </w:r>
-      <w:bookmarkEnd w:id="18"/>
     </w:p>
     <w:p>
       <w:pPr>
@@ -5524,7 +5741,72 @@
           <w:sz w:val="26"/>
           <w:szCs w:val="26"/>
         </w:rPr>
-        <w:t xml:space="preserve">Lịch trình kiểm thử được triển khai theo mô hình Agile/Scrum. Nhóm gồm 4 thành. Dự án chia làm 4 giai đoạn chính (1 Sprint 0 chuẩn bị, 3 Sprint thực thi và 1 Tuần dự phòng). </w:t>
+        <w:lastRenderedPageBreak/>
+        <w:t xml:space="preserve">Lịch trình kiểm thử được triển khai theo mô hình Agile/Scrum. Nhóm gồm </w:t>
+      </w:r>
+      <w:r>
+        <w:rPr>
+          <w:rFonts w:ascii="Times New Roman" w:eastAsia="Times New Roman" w:hAnsi="Times New Roman" w:cs="Times New Roman"/>
+          <w:sz w:val="26"/>
+          <w:szCs w:val="26"/>
+        </w:rPr>
+        <w:t>3</w:t>
+      </w:r>
+      <w:r>
+        <w:rPr>
+          <w:rFonts w:ascii="Times New Roman" w:eastAsia="Times New Roman" w:hAnsi="Times New Roman" w:cs="Times New Roman"/>
+          <w:sz w:val="26"/>
+          <w:szCs w:val="26"/>
+        </w:rPr>
+        <w:t xml:space="preserve"> thành</w:t>
+      </w:r>
+      <w:r>
+        <w:rPr>
+          <w:rFonts w:ascii="Times New Roman" w:eastAsia="Times New Roman" w:hAnsi="Times New Roman" w:cs="Times New Roman"/>
+          <w:sz w:val="26"/>
+          <w:szCs w:val="26"/>
+        </w:rPr>
+        <w:t xml:space="preserve"> viên</w:t>
+      </w:r>
+      <w:r>
+        <w:rPr>
+          <w:rFonts w:ascii="Times New Roman" w:eastAsia="Times New Roman" w:hAnsi="Times New Roman" w:cs="Times New Roman"/>
+          <w:sz w:val="26"/>
+          <w:szCs w:val="26"/>
+        </w:rPr>
+        <w:t xml:space="preserve">. Dự án chia làm </w:t>
+      </w:r>
+      <w:r>
+        <w:rPr>
+          <w:rFonts w:ascii="Times New Roman" w:eastAsia="Times New Roman" w:hAnsi="Times New Roman" w:cs="Times New Roman"/>
+          <w:sz w:val="26"/>
+          <w:szCs w:val="26"/>
+        </w:rPr>
+        <w:t>5</w:t>
+      </w:r>
+      <w:r>
+        <w:rPr>
+          <w:rFonts w:ascii="Times New Roman" w:eastAsia="Times New Roman" w:hAnsi="Times New Roman" w:cs="Times New Roman"/>
+          <w:sz w:val="26"/>
+          <w:szCs w:val="26"/>
+        </w:rPr>
+        <w:t xml:space="preserve"> giai đoạn chính (1 Sprint 0 chuẩn bị, </w:t>
+      </w:r>
+      <w:r>
+        <w:rPr>
+          <w:rFonts w:ascii="Times New Roman" w:eastAsia="Times New Roman" w:hAnsi="Times New Roman" w:cs="Times New Roman"/>
+          <w:sz w:val="26"/>
+          <w:szCs w:val="26"/>
+        </w:rPr>
+        <w:t>4</w:t>
+      </w:r>
+      <w:r>
+        <w:rPr>
+          <w:rFonts w:ascii="Times New Roman" w:eastAsia="Times New Roman" w:hAnsi="Times New Roman" w:cs="Times New Roman"/>
+          <w:sz w:val="26"/>
+          <w:szCs w:val="26"/>
+        </w:rPr>
+        <w:t xml:space="preserve"> Sprint thực thi và 1 Tuần dự phòng). </w:t>
       </w:r>
     </w:p>
     <w:p>
@@ -5544,14 +5826,14 @@
           <w:szCs w:val="26"/>
         </w:rPr>
       </w:pPr>
-      <w:bookmarkStart w:id="19" w:name="_Toc237628340"/>
+      <w:bookmarkStart w:id="18" w:name="_Toc238059524"/>
       <w:r>
         <w:rPr>
           <w:szCs w:val="26"/>
         </w:rPr>
         <w:t>6.1 Giai đoạn tiền đề: SPRINT 0</w:t>
       </w:r>
-      <w:bookmarkEnd w:id="19"/>
+      <w:bookmarkEnd w:id="18"/>
     </w:p>
     <w:p>
       <w:pPr>
@@ -5568,7 +5850,15 @@
           <w:sz w:val="26"/>
           <w:szCs w:val="26"/>
         </w:rPr>
-        <w:t>Giai đoạn khẩn cấp chuẩn bị nền tảng công cụ và API trước khi bước vào 3 tuần kiểm thử chính thức. Các hạng mục sau đã hoàn tất 100%:</w:t>
+        <w:t xml:space="preserve">Đã </w:t>
+      </w:r>
+      <w:r>
+        <w:rPr>
+          <w:rFonts w:ascii="Times New Roman" w:hAnsi="Times New Roman" w:cs="Times New Roman"/>
+          <w:sz w:val="26"/>
+          <w:szCs w:val="26"/>
+        </w:rPr>
+        <w:t>hoàn tất 100%:</w:t>
       </w:r>
     </w:p>
     <w:p>
@@ -5640,7 +5930,6 @@
           <w:sz w:val="26"/>
           <w:szCs w:val="26"/>
         </w:rPr>
-        <w:lastRenderedPageBreak/>
         <w:t>CI/CD Pipeline: Thiết lập GitHub Actions chạy ổn định (Build &amp; Test tự động, CD Deploy to Production khi merge vào main).</w:t>
       </w:r>
     </w:p>
@@ -5662,7 +5951,7 @@
           <w:szCs w:val="26"/>
         </w:rPr>
       </w:pPr>
-      <w:bookmarkStart w:id="20" w:name="_Toc237628341"/>
+      <w:bookmarkStart w:id="19" w:name="_Toc238059525"/>
       <w:r>
         <w:rPr>
           <w:szCs w:val="26"/>
@@ -5681,7 +5970,7 @@
         </w:rPr>
         <w:t>iểm thử</w:t>
       </w:r>
-      <w:bookmarkEnd w:id="20"/>
+      <w:bookmarkEnd w:id="19"/>
     </w:p>
     <w:tbl>
       <w:tblPr>
@@ -5690,14 +5979,14 @@
         <w:tblLook w:val="04A0" w:firstRow="1" w:lastRow="0" w:firstColumn="1" w:lastColumn="0" w:noHBand="0" w:noVBand="1"/>
       </w:tblPr>
       <w:tblGrid>
-        <w:gridCol w:w="1555"/>
-        <w:gridCol w:w="4394"/>
-        <w:gridCol w:w="3401"/>
+        <w:gridCol w:w="1513"/>
+        <w:gridCol w:w="4152"/>
+        <w:gridCol w:w="3685"/>
       </w:tblGrid>
       <w:tr>
         <w:tc>
           <w:tcPr>
-            <w:tcW w:w="1555" w:type="dxa"/>
+            <w:tcW w:w="1513" w:type="dxa"/>
             <w:vAlign w:val="center"/>
           </w:tcPr>
           <w:p>
@@ -5721,7 +6010,7 @@
         </w:tc>
         <w:tc>
           <w:tcPr>
-            <w:tcW w:w="4394" w:type="dxa"/>
+            <w:tcW w:w="4152" w:type="dxa"/>
             <w:vAlign w:val="center"/>
           </w:tcPr>
           <w:p>
@@ -5745,7 +6034,7 @@
         </w:tc>
         <w:tc>
           <w:tcPr>
-            <w:tcW w:w="3401" w:type="dxa"/>
+            <w:tcW w:w="3685" w:type="dxa"/>
             <w:vAlign w:val="center"/>
           </w:tcPr>
           <w:p>
@@ -5771,7 +6060,7 @@
       <w:tr>
         <w:tc>
           <w:tcPr>
-            <w:tcW w:w="1555" w:type="dxa"/>
+            <w:tcW w:w="1513" w:type="dxa"/>
             <w:vAlign w:val="center"/>
           </w:tcPr>
           <w:p>
@@ -5795,7 +6084,7 @@
         </w:tc>
         <w:tc>
           <w:tcPr>
-            <w:tcW w:w="4394" w:type="dxa"/>
+            <w:tcW w:w="4152" w:type="dxa"/>
             <w:vAlign w:val="center"/>
           </w:tcPr>
           <w:p>
@@ -5873,7 +6162,7 @@
         </w:tc>
         <w:tc>
           <w:tcPr>
-            <w:tcW w:w="3401" w:type="dxa"/>
+            <w:tcW w:w="3685" w:type="dxa"/>
             <w:vAlign w:val="center"/>
           </w:tcPr>
           <w:p>
@@ -5953,7 +6242,7 @@
       <w:tr>
         <w:tc>
           <w:tcPr>
-            <w:tcW w:w="1555" w:type="dxa"/>
+            <w:tcW w:w="1513" w:type="dxa"/>
             <w:vAlign w:val="center"/>
           </w:tcPr>
           <w:p>
@@ -5977,7 +6266,7 @@
         </w:tc>
         <w:tc>
           <w:tcPr>
-            <w:tcW w:w="4394" w:type="dxa"/>
+            <w:tcW w:w="4152" w:type="dxa"/>
             <w:vAlign w:val="center"/>
           </w:tcPr>
           <w:p>
@@ -6067,67 +6356,105 @@
                 <w:sz w:val="26"/>
                 <w:szCs w:val="26"/>
               </w:rPr>
+              <w:lastRenderedPageBreak/>
               <w:t>- Cập nhật RTM.xlsx, ánh xạ 100% Requirement ID ↔ Test Case ID.</w:t>
             </w:r>
           </w:p>
-        </w:tc>
-        <w:tc>
-          <w:tcPr>
-            <w:tcW w:w="3401" w:type="dxa"/>
-            <w:vAlign w:val="center"/>
-          </w:tcPr>
-          <w:p>
-            <w:pPr>
-              <w:spacing w:after="0" w:line="240" w:lineRule="auto"/>
-              <w:rPr>
-                <w:rFonts w:ascii="Times New Roman" w:hAnsi="Times New Roman" w:cs="Times New Roman"/>
-                <w:sz w:val="26"/>
-                <w:szCs w:val="26"/>
-              </w:rPr>
-            </w:pPr>
-            <w:r>
-              <w:rPr>
-                <w:rFonts w:ascii="Times New Roman" w:hAnsi="Times New Roman" w:cs="Times New Roman"/>
-                <w:sz w:val="26"/>
-                <w:szCs w:val="26"/>
-              </w:rPr>
-              <w:t>- Test_Execution_Report.xlsx</w:t>
-            </w:r>
-          </w:p>
-          <w:p>
-            <w:pPr>
-              <w:spacing w:after="0" w:line="240" w:lineRule="auto"/>
-              <w:rPr>
-                <w:rFonts w:ascii="Times New Roman" w:hAnsi="Times New Roman" w:cs="Times New Roman"/>
-                <w:sz w:val="26"/>
-                <w:szCs w:val="26"/>
-              </w:rPr>
-            </w:pPr>
-            <w:r>
-              <w:rPr>
-                <w:rFonts w:ascii="Times New Roman" w:hAnsi="Times New Roman" w:cs="Times New Roman"/>
-                <w:sz w:val="26"/>
-                <w:szCs w:val="26"/>
-              </w:rPr>
-              <w:t>- 8+ Bug Tickets chuẩn trên Jira</w:t>
-            </w:r>
-          </w:p>
-          <w:p>
-            <w:pPr>
-              <w:spacing w:after="0" w:line="240" w:lineRule="auto"/>
-              <w:rPr>
-                <w:rFonts w:ascii="Times New Roman" w:hAnsi="Times New Roman" w:cs="Times New Roman"/>
-                <w:sz w:val="26"/>
-                <w:szCs w:val="26"/>
-              </w:rPr>
-            </w:pPr>
-            <w:r>
-              <w:rPr>
-                <w:rFonts w:ascii="Times New Roman" w:hAnsi="Times New Roman" w:cs="Times New Roman"/>
-                <w:sz w:val="26"/>
-                <w:szCs w:val="26"/>
-              </w:rPr>
-              <w:t>- 5 Script CodeceptJS (E2E) + Postman Collection (đã có BVA)</w:t>
+          <w:p>
+            <w:pPr>
+              <w:spacing w:after="0" w:line="240" w:lineRule="auto"/>
+              <w:rPr>
+                <w:rFonts w:ascii="Times New Roman" w:hAnsi="Times New Roman" w:cs="Times New Roman"/>
+                <w:sz w:val="26"/>
+                <w:szCs w:val="26"/>
+              </w:rPr>
+            </w:pPr>
+            <w:r>
+              <w:rPr>
+                <w:rFonts w:ascii="Times New Roman" w:hAnsi="Times New Roman" w:cs="Times New Roman"/>
+                <w:sz w:val="26"/>
+                <w:szCs w:val="26"/>
+              </w:rPr>
+              <w:t>- Áp dụng White-box Testing (JaCoCo + đo % coverage).</w:t>
+            </w:r>
+          </w:p>
+          <w:p>
+            <w:pPr>
+              <w:spacing w:after="0" w:line="240" w:lineRule="auto"/>
+              <w:rPr>
+                <w:rFonts w:ascii="Times New Roman" w:hAnsi="Times New Roman" w:cs="Times New Roman"/>
+                <w:sz w:val="26"/>
+                <w:szCs w:val="26"/>
+              </w:rPr>
+            </w:pPr>
+            <w:r>
+              <w:rPr>
+                <w:rFonts w:ascii="Times New Roman" w:hAnsi="Times New Roman" w:cs="Times New Roman"/>
+                <w:sz w:val="26"/>
+                <w:szCs w:val="26"/>
+              </w:rPr>
+              <w:t>- Áp dụng State Transition Testing (Order + Cart).</w:t>
+            </w:r>
+          </w:p>
+          <w:p>
+            <w:pPr>
+              <w:spacing w:after="0" w:line="240" w:lineRule="auto"/>
+              <w:rPr>
+                <w:rFonts w:ascii="Times New Roman" w:hAnsi="Times New Roman" w:cs="Times New Roman"/>
+                <w:sz w:val="26"/>
+                <w:szCs w:val="26"/>
+              </w:rPr>
+            </w:pPr>
+            <w:r>
+              <w:rPr>
+                <w:rFonts w:ascii="Times New Roman" w:hAnsi="Times New Roman" w:cs="Times New Roman"/>
+                <w:sz w:val="26"/>
+                <w:szCs w:val="26"/>
+              </w:rPr>
+              <w:t>- Áp dụng Decision Table Testing (ma trận phân quyền).</w:t>
+            </w:r>
+          </w:p>
+        </w:tc>
+        <w:tc>
+          <w:tcPr>
+            <w:tcW w:w="3685" w:type="dxa"/>
+            <w:vAlign w:val="center"/>
+          </w:tcPr>
+          <w:p>
+            <w:pPr>
+              <w:spacing w:after="0" w:line="240" w:lineRule="auto"/>
+              <w:rPr>
+                <w:rFonts w:ascii="Times New Roman" w:hAnsi="Times New Roman" w:cs="Times New Roman"/>
+                <w:sz w:val="26"/>
+                <w:szCs w:val="26"/>
+              </w:rPr>
+            </w:pPr>
+            <w:r>
+              <w:rPr>
+                <w:rFonts w:ascii="Times New Roman" w:hAnsi="Times New Roman" w:cs="Times New Roman"/>
+                <w:sz w:val="26"/>
+                <w:szCs w:val="26"/>
+              </w:rPr>
+              <w:lastRenderedPageBreak/>
+              <w:t>- Test_Case_Report_FE.xlsx + Test_Case_Report_API.xlsx</w:t>
+            </w:r>
+          </w:p>
+          <w:p>
+            <w:pPr>
+              <w:spacing w:after="0" w:line="240" w:lineRule="auto"/>
+              <w:rPr>
+                <w:rFonts w:ascii="Times New Roman" w:hAnsi="Times New Roman" w:cs="Times New Roman"/>
+                <w:sz w:val="26"/>
+                <w:szCs w:val="26"/>
+              </w:rPr>
+            </w:pPr>
+            <w:r>
+              <w:rPr>
+                <w:rFonts w:ascii="Times New Roman" w:hAnsi="Times New Roman" w:cs="Times New Roman"/>
+                <w:sz w:val="26"/>
+                <w:szCs w:val="26"/>
+              </w:rPr>
+              <w:t>- Bug_Report.xlsx + Bug Tickets trên Jira</w:t>
             </w:r>
           </w:p>
           <w:p>
@@ -6163,7 +6490,72 @@
                 <w:sz w:val="26"/>
                 <w:szCs w:val="26"/>
               </w:rPr>
-              <w:t>- Unit test pass CI/CD</w:t>
+              <w:t>- Test_Case_WhiteBox.xlsx + Coverage_Report</w:t>
+            </w:r>
+          </w:p>
+          <w:p>
+            <w:pPr>
+              <w:spacing w:after="0" w:line="240" w:lineRule="auto"/>
+              <w:rPr>
+                <w:rFonts w:ascii="Times New Roman" w:hAnsi="Times New Roman" w:cs="Times New Roman"/>
+                <w:sz w:val="26"/>
+                <w:szCs w:val="26"/>
+              </w:rPr>
+            </w:pPr>
+            <w:r>
+              <w:rPr>
+                <w:rFonts w:ascii="Times New Roman" w:hAnsi="Times New Roman" w:cs="Times New Roman"/>
+                <w:sz w:val="26"/>
+                <w:szCs w:val="26"/>
+              </w:rPr>
+              <w:t>- Test_Case_StateTransition.xlsx + sơ đồ</w:t>
+            </w:r>
+          </w:p>
+          <w:p>
+            <w:pPr>
+              <w:spacing w:after="0" w:line="240" w:lineRule="auto"/>
+              <w:rPr>
+                <w:rFonts w:ascii="Times New Roman" w:hAnsi="Times New Roman" w:cs="Times New Roman"/>
+                <w:sz w:val="26"/>
+                <w:szCs w:val="26"/>
+              </w:rPr>
+            </w:pPr>
+            <w:r>
+              <w:rPr>
+                <w:rFonts w:ascii="Times New Roman" w:hAnsi="Times New Roman" w:cs="Times New Roman"/>
+                <w:sz w:val="26"/>
+                <w:szCs w:val="26"/>
+              </w:rPr>
+              <w:t>- Test_Ca</w:t>
+            </w:r>
+            <w:bookmarkStart w:id="20" w:name="_GoBack"/>
+            <w:bookmarkEnd w:id="20"/>
+            <w:r>
+              <w:rPr>
+                <w:rFonts w:ascii="Times New Roman" w:hAnsi="Times New Roman" w:cs="Times New Roman"/>
+                <w:sz w:val="26"/>
+                <w:szCs w:val="26"/>
+              </w:rPr>
+              <w:t>se_DecisionTable.xlsx</w:t>
+            </w:r>
+          </w:p>
+          <w:p>
+            <w:pPr>
+              <w:spacing w:after="0" w:line="240" w:lineRule="auto"/>
+              <w:rPr>
+                <w:rFonts w:ascii="Times New Roman" w:hAnsi="Times New Roman" w:cs="Times New Roman"/>
+                <w:sz w:val="26"/>
+                <w:szCs w:val="26"/>
+              </w:rPr>
+            </w:pPr>
+            <w:r>
+              <w:rPr>
+                <w:rFonts w:ascii="Times New Roman" w:hAnsi="Times New Roman" w:cs="Times New Roman"/>
+                <w:sz w:val="26"/>
+                <w:szCs w:val="26"/>
+              </w:rPr>
+              <w:lastRenderedPageBreak/>
+              <w:t>- Unit Test pass CI/CD</w:t>
             </w:r>
           </w:p>
         </w:tc>
@@ -6171,31 +6563,32 @@
       <w:tr>
         <w:tc>
           <w:tcPr>
-            <w:tcW w:w="1555" w:type="dxa"/>
-            <w:vAlign w:val="center"/>
-          </w:tcPr>
-          <w:p>
-            <w:pPr>
-              <w:spacing w:after="0" w:line="240" w:lineRule="auto"/>
-              <w:rPr>
-                <w:rFonts w:ascii="Times New Roman" w:hAnsi="Times New Roman" w:cs="Times New Roman"/>
-                <w:sz w:val="26"/>
-                <w:szCs w:val="26"/>
-              </w:rPr>
-            </w:pPr>
-            <w:r>
-              <w:rPr>
-                <w:rFonts w:ascii="Times New Roman" w:hAnsi="Times New Roman" w:cs="Times New Roman"/>
-                <w:sz w:val="26"/>
-                <w:szCs w:val="26"/>
-              </w:rPr>
+            <w:tcW w:w="1513" w:type="dxa"/>
+            <w:vAlign w:val="center"/>
+          </w:tcPr>
+          <w:p>
+            <w:pPr>
+              <w:spacing w:after="0" w:line="240" w:lineRule="auto"/>
+              <w:rPr>
+                <w:rFonts w:ascii="Times New Roman" w:hAnsi="Times New Roman" w:cs="Times New Roman"/>
+                <w:sz w:val="26"/>
+                <w:szCs w:val="26"/>
+              </w:rPr>
+            </w:pPr>
+            <w:r>
+              <w:rPr>
+                <w:rFonts w:ascii="Times New Roman" w:hAnsi="Times New Roman" w:cs="Times New Roman"/>
+                <w:sz w:val="26"/>
+                <w:szCs w:val="26"/>
+              </w:rPr>
+              <w:lastRenderedPageBreak/>
               <w:t>Fix Bug</w:t>
             </w:r>
           </w:p>
         </w:tc>
         <w:tc>
           <w:tcPr>
-            <w:tcW w:w="4394" w:type="dxa"/>
+            <w:tcW w:w="4152" w:type="dxa"/>
             <w:vAlign w:val="center"/>
           </w:tcPr>
           <w:p>
@@ -6287,7 +6680,7 @@
         </w:tc>
         <w:tc>
           <w:tcPr>
-            <w:tcW w:w="3401" w:type="dxa"/>
+            <w:tcW w:w="3685" w:type="dxa"/>
             <w:vAlign w:val="center"/>
           </w:tcPr>
           <w:p>
@@ -6331,7 +6724,7 @@
       <w:tr>
         <w:tc>
           <w:tcPr>
-            <w:tcW w:w="1555" w:type="dxa"/>
+            <w:tcW w:w="1513" w:type="dxa"/>
             <w:vAlign w:val="center"/>
           </w:tcPr>
           <w:p>
@@ -6355,7 +6748,7 @@
         </w:tc>
         <w:tc>
           <w:tcPr>
-            <w:tcW w:w="4394" w:type="dxa"/>
+            <w:tcW w:w="4152" w:type="dxa"/>
             <w:vAlign w:val="center"/>
           </w:tcPr>
           <w:p>
@@ -6465,7 +6858,7 @@
         </w:tc>
         <w:tc>
           <w:tcPr>
-            <w:tcW w:w="3401" w:type="dxa"/>
+            <w:tcW w:w="3685" w:type="dxa"/>
             <w:vAlign w:val="center"/>
           </w:tcPr>
           <w:p>
@@ -6549,54 +6942,270 @@
           <w:szCs w:val="26"/>
         </w:rPr>
       </w:pPr>
-      <w:bookmarkStart w:id="21" w:name="_Toc237628342"/>
-      <w:r>
-        <w:rPr>
+      <w:bookmarkStart w:id="21" w:name="_Toc238059526"/>
+      <w:r>
+        <w:rPr>
+          <w:szCs w:val="26"/>
+        </w:rPr>
+        <w:t>6.3 Tuần Dự Phòng</w:t>
+      </w:r>
+      <w:bookmarkEnd w:id="21"/>
+      <w:r>
+        <w:rPr>
+          <w:szCs w:val="26"/>
+        </w:rPr>
+        <w:t xml:space="preserve"> </w:t>
+      </w:r>
+    </w:p>
+    <w:p>
+      <w:pPr>
+        <w:rPr>
+          <w:rFonts w:ascii="Times New Roman" w:hAnsi="Times New Roman" w:cs="Times New Roman"/>
+          <w:sz w:val="26"/>
+          <w:szCs w:val="26"/>
+        </w:rPr>
+      </w:pPr>
+      <w:r>
+        <w:rPr>
+          <w:rFonts w:ascii="Times New Roman" w:hAnsi="Times New Roman" w:cs="Times New Roman"/>
+          <w:sz w:val="26"/>
+          <w:szCs w:val="26"/>
+        </w:rPr>
+        <w:t xml:space="preserve">Không giao task cố định. </w:t>
+      </w:r>
+    </w:p>
+    <w:p>
+      <w:pPr>
+        <w:rPr>
+          <w:rFonts w:ascii="Times New Roman" w:hAnsi="Times New Roman" w:cs="Times New Roman"/>
+          <w:sz w:val="26"/>
+          <w:szCs w:val="26"/>
+        </w:rPr>
+      </w:pPr>
+      <w:r>
+        <w:rPr>
+          <w:rFonts w:ascii="Times New Roman" w:hAnsi="Times New Roman" w:cs="Times New Roman"/>
+          <w:sz w:val="26"/>
+          <w:szCs w:val="26"/>
+        </w:rPr>
+        <w:t xml:space="preserve">Mục đích: Xử lý các task tồn đọng nếu Tuần 3 chậm tiến độ, tinh chỉnh format tài liệu, hoặc thực hiện bổ sung Test Case/Unit Test nếu Giảng viên yêu cầu thêm sau đợt review giữa kỳ. </w:t>
+      </w:r>
+    </w:p>
+    <w:p>
+      <w:pPr>
+        <w:jc w:val="both"/>
+        <w:rPr>
+          <w:rFonts w:ascii="Times New Roman" w:hAnsi="Times New Roman" w:cs="Times New Roman"/>
+          <w:sz w:val="26"/>
+          <w:szCs w:val="26"/>
+        </w:rPr>
+      </w:pPr>
+    </w:p>
+    <w:p>
+      <w:pPr>
+        <w:pStyle w:val="Heading1"/>
+        <w:jc w:val="both"/>
+        <w:rPr>
+          <w:szCs w:val="26"/>
+        </w:rPr>
+      </w:pPr>
+      <w:bookmarkStart w:id="22" w:name="_Toc238059527"/>
+      <w:r>
+        <w:rPr>
+          <w:szCs w:val="26"/>
+        </w:rPr>
+        <w:t>7. QUY TRÌNH QUẢN LÝ LỖI (Defect Management Process)</w:t>
+      </w:r>
+      <w:bookmarkEnd w:id="22"/>
+    </w:p>
+    <w:p>
+      <w:pPr>
+        <w:jc w:val="both"/>
+        <w:rPr>
+          <w:rFonts w:ascii="Times New Roman" w:hAnsi="Times New Roman" w:cs="Times New Roman"/>
+          <w:sz w:val="26"/>
+          <w:szCs w:val="26"/>
+        </w:rPr>
+      </w:pPr>
+      <w:r>
+        <w:rPr>
+          <w:rFonts w:ascii="Times New Roman" w:hAnsi="Times New Roman" w:cs="Times New Roman"/>
+          <w:sz w:val="26"/>
+          <w:szCs w:val="26"/>
+        </w:rPr>
+        <w:t xml:space="preserve">Mọi lỗi (Bug) phát hiện trong quá trình kiểm thử sẽ được xử lý theo quy trình sau: </w:t>
+      </w:r>
+    </w:p>
+    <w:p>
+      <w:pPr>
+        <w:jc w:val="both"/>
+        <w:rPr>
+          <w:rFonts w:ascii="Times New Roman" w:hAnsi="Times New Roman" w:cs="Times New Roman"/>
+          <w:sz w:val="26"/>
+          <w:szCs w:val="26"/>
+        </w:rPr>
+      </w:pPr>
+      <w:r>
+        <w:rPr>
+          <w:rFonts w:ascii="Times New Roman" w:hAnsi="Times New Roman" w:cs="Times New Roman"/>
+          <w:sz w:val="26"/>
+          <w:szCs w:val="26"/>
+        </w:rPr>
+        <w:t xml:space="preserve">Phát hiện lỗi: Tester phát hiện sự cố trên FE hoặc API. </w:t>
+      </w:r>
+    </w:p>
+    <w:p>
+      <w:pPr>
+        <w:jc w:val="both"/>
+        <w:rPr>
+          <w:rFonts w:ascii="Times New Roman" w:hAnsi="Times New Roman" w:cs="Times New Roman"/>
+          <w:sz w:val="26"/>
+          <w:szCs w:val="26"/>
+        </w:rPr>
+      </w:pPr>
+      <w:r>
+        <w:rPr>
+          <w:rFonts w:ascii="Times New Roman" w:hAnsi="Times New Roman" w:cs="Times New Roman"/>
+          <w:sz w:val="26"/>
+          <w:szCs w:val="26"/>
+        </w:rPr>
+        <w:t xml:space="preserve">Xác minh lỗi: Kiểm tra log Backend, Network tab, hoặc Postman response để xác định nguyên nhân. </w:t>
+      </w:r>
+    </w:p>
+    <w:p>
+      <w:pPr>
+        <w:jc w:val="both"/>
+        <w:rPr>
+          <w:rFonts w:ascii="Times New Roman" w:hAnsi="Times New Roman" w:cs="Times New Roman"/>
+          <w:sz w:val="26"/>
+          <w:szCs w:val="26"/>
+        </w:rPr>
+      </w:pPr>
+      <w:r>
+        <w:rPr>
+          <w:rFonts w:ascii="Times New Roman" w:hAnsi="Times New Roman" w:cs="Times New Roman"/>
+          <w:sz w:val="26"/>
           <w:szCs w:val="26"/>
         </w:rPr>
         <w:lastRenderedPageBreak/>
-        <w:t>6.3 Tuần Dự Phòng</w:t>
-      </w:r>
-      <w:bookmarkEnd w:id="21"/>
-      <w:r>
-        <w:rPr>
-          <w:szCs w:val="26"/>
-        </w:rPr>
-        <w:t xml:space="preserve"> </w:t>
-      </w:r>
-    </w:p>
-    <w:p>
-      <w:pPr>
-        <w:rPr>
-          <w:rFonts w:ascii="Times New Roman" w:hAnsi="Times New Roman" w:cs="Times New Roman"/>
-          <w:sz w:val="26"/>
-          <w:szCs w:val="26"/>
-        </w:rPr>
-      </w:pPr>
-      <w:r>
-        <w:rPr>
-          <w:rFonts w:ascii="Times New Roman" w:hAnsi="Times New Roman" w:cs="Times New Roman"/>
-          <w:sz w:val="26"/>
-          <w:szCs w:val="26"/>
-        </w:rPr>
-        <w:t xml:space="preserve">Không giao task cố định. </w:t>
-      </w:r>
-    </w:p>
-    <w:p>
-      <w:pPr>
-        <w:rPr>
-          <w:rFonts w:ascii="Times New Roman" w:hAnsi="Times New Roman" w:cs="Times New Roman"/>
-          <w:sz w:val="26"/>
-          <w:szCs w:val="26"/>
-        </w:rPr>
-      </w:pPr>
-      <w:r>
-        <w:rPr>
-          <w:rFonts w:ascii="Times New Roman" w:hAnsi="Times New Roman" w:cs="Times New Roman"/>
-          <w:sz w:val="26"/>
-          <w:szCs w:val="26"/>
-        </w:rPr>
-        <w:t xml:space="preserve">Mục đích: Xử lý các task tồn đọng nếu Tuần 3 chậm tiến độ, tinh chỉnh format tài liệu, hoặc thực hiện bổ sung Test Case/Unit Test nếu Giảng viên yêu cầu thêm sau đợt review giữa kỳ. </w:t>
+        <w:t xml:space="preserve">Ghi nhận (Log Bug): Tạo Bug Ticket trên Jira / điền vào Bug_Report.xlsx kèm đầy đủ ảnh chụp, Response Body và đề xuất hướng xử lý. </w:t>
+      </w:r>
+    </w:p>
+    <w:p>
+      <w:pPr>
+        <w:jc w:val="both"/>
+        <w:rPr>
+          <w:rFonts w:ascii="Times New Roman" w:hAnsi="Times New Roman" w:cs="Times New Roman"/>
+          <w:sz w:val="26"/>
+          <w:szCs w:val="26"/>
+        </w:rPr>
+      </w:pPr>
+      <w:r>
+        <w:rPr>
+          <w:rFonts w:ascii="Times New Roman" w:hAnsi="Times New Roman" w:cs="Times New Roman"/>
+          <w:sz w:val="26"/>
+          <w:szCs w:val="26"/>
+        </w:rPr>
+        <w:t xml:space="preserve">Cập nhật trạng thái: Nếu lỗi không được fix do hạn chế nhân sự, ghi nhận trạng thái Known Issue phục vụ báo cáo nghiệm thu. </w:t>
+      </w:r>
+    </w:p>
+    <w:p>
+      <w:pPr>
+        <w:jc w:val="both"/>
+        <w:rPr>
+          <w:rFonts w:ascii="Times New Roman" w:hAnsi="Times New Roman" w:cs="Times New Roman"/>
+          <w:sz w:val="26"/>
+          <w:szCs w:val="26"/>
+        </w:rPr>
+      </w:pPr>
+    </w:p>
+    <w:p>
+      <w:pPr>
+        <w:pStyle w:val="Heading2"/>
+        <w:jc w:val="both"/>
+        <w:rPr>
+          <w:szCs w:val="26"/>
+        </w:rPr>
+      </w:pPr>
+      <w:bookmarkStart w:id="23" w:name="_Toc238059528"/>
+      <w:r>
+        <w:rPr>
+          <w:szCs w:val="26"/>
+        </w:rPr>
+        <w:t>7.1 Phân loại độ nghiêm trọng của lỗi (Severity Levels)</w:t>
+      </w:r>
+      <w:bookmarkEnd w:id="23"/>
+    </w:p>
+    <w:p>
+      <w:pPr>
+        <w:jc w:val="both"/>
+        <w:rPr>
+          <w:rFonts w:ascii="Times New Roman" w:hAnsi="Times New Roman" w:cs="Times New Roman"/>
+          <w:sz w:val="26"/>
+          <w:szCs w:val="26"/>
+        </w:rPr>
+      </w:pPr>
+      <w:r>
+        <w:rPr>
+          <w:rFonts w:ascii="Times New Roman" w:hAnsi="Times New Roman" w:cs="Times New Roman"/>
+          <w:sz w:val="26"/>
+          <w:szCs w:val="26"/>
+        </w:rPr>
+        <w:t xml:space="preserve">Blocker / Critical: Hệ thống sập, nổ lỗi 500 không bắt được exception, không thể đăng nhập, không thể checkout. </w:t>
+      </w:r>
+    </w:p>
+    <w:p>
+      <w:pPr>
+        <w:jc w:val="both"/>
+        <w:rPr>
+          <w:rFonts w:ascii="Times New Roman" w:hAnsi="Times New Roman" w:cs="Times New Roman"/>
+          <w:sz w:val="26"/>
+          <w:szCs w:val="26"/>
+        </w:rPr>
+      </w:pPr>
+      <w:r>
+        <w:rPr>
+          <w:rFonts w:ascii="Times New Roman" w:hAnsi="Times New Roman" w:cs="Times New Roman"/>
+          <w:sz w:val="26"/>
+          <w:szCs w:val="26"/>
+        </w:rPr>
+        <w:t xml:space="preserve">Major: Tính năng sai logic nghiệp vụ (ví dụ: hủy đơn nhưng không hoàn tồn kho, giá sản phẩm bị sai). </w:t>
+      </w:r>
+    </w:p>
+    <w:p>
+      <w:pPr>
+        <w:jc w:val="both"/>
+        <w:rPr>
+          <w:rFonts w:ascii="Times New Roman" w:hAnsi="Times New Roman" w:cs="Times New Roman"/>
+          <w:sz w:val="26"/>
+          <w:szCs w:val="26"/>
+        </w:rPr>
+      </w:pPr>
+      <w:r>
+        <w:rPr>
+          <w:rFonts w:ascii="Times New Roman" w:hAnsi="Times New Roman" w:cs="Times New Roman"/>
+          <w:sz w:val="26"/>
+          <w:szCs w:val="26"/>
+        </w:rPr>
+        <w:t xml:space="preserve">Medium: Lỗi phân quyền nhẹ, lỗi hiển thị thông báo không rõ ràng trên FE, thiếu validate form. </w:t>
+      </w:r>
+    </w:p>
+    <w:p>
+      <w:pPr>
+        <w:jc w:val="both"/>
+        <w:rPr>
+          <w:rFonts w:ascii="Times New Roman" w:hAnsi="Times New Roman" w:cs="Times New Roman"/>
+          <w:sz w:val="26"/>
+          <w:szCs w:val="26"/>
+        </w:rPr>
+      </w:pPr>
+      <w:r>
+        <w:rPr>
+          <w:rFonts w:ascii="Times New Roman" w:hAnsi="Times New Roman" w:cs="Times New Roman"/>
+          <w:sz w:val="26"/>
+          <w:szCs w:val="26"/>
+        </w:rPr>
+        <w:t xml:space="preserve">Low: Lỗi giao diện, lệch font, sai lỗi chính tả. </w:t>
       </w:r>
     </w:p>
     <w:p>
@@ -6617,223 +7226,7 @@
           <w:szCs w:val="26"/>
         </w:rPr>
       </w:pPr>
-      <w:bookmarkStart w:id="22" w:name="_Toc237628343"/>
-      <w:r>
-        <w:rPr>
-          <w:szCs w:val="26"/>
-        </w:rPr>
-        <w:t>7. QUY TRÌNH QUẢN LÝ LỖI (Defect Management Process)</w:t>
-      </w:r>
-      <w:bookmarkEnd w:id="22"/>
-    </w:p>
-    <w:p>
-      <w:pPr>
-        <w:jc w:val="both"/>
-        <w:rPr>
-          <w:rFonts w:ascii="Times New Roman" w:hAnsi="Times New Roman" w:cs="Times New Roman"/>
-          <w:sz w:val="26"/>
-          <w:szCs w:val="26"/>
-        </w:rPr>
-      </w:pPr>
-      <w:r>
-        <w:rPr>
-          <w:rFonts w:ascii="Times New Roman" w:hAnsi="Times New Roman" w:cs="Times New Roman"/>
-          <w:sz w:val="26"/>
-          <w:szCs w:val="26"/>
-        </w:rPr>
-        <w:t xml:space="preserve">Mọi lỗi (Bug) phát hiện trong quá trình kiểm thử sẽ được xử lý theo quy trình sau: </w:t>
-      </w:r>
-    </w:p>
-    <w:p>
-      <w:pPr>
-        <w:jc w:val="both"/>
-        <w:rPr>
-          <w:rFonts w:ascii="Times New Roman" w:hAnsi="Times New Roman" w:cs="Times New Roman"/>
-          <w:sz w:val="26"/>
-          <w:szCs w:val="26"/>
-        </w:rPr>
-      </w:pPr>
-      <w:r>
-        <w:rPr>
-          <w:rFonts w:ascii="Times New Roman" w:hAnsi="Times New Roman" w:cs="Times New Roman"/>
-          <w:sz w:val="26"/>
-          <w:szCs w:val="26"/>
-        </w:rPr>
-        <w:t xml:space="preserve">Phát hiện lỗi: Tester phát hiện sự cố trên FE hoặc API. </w:t>
-      </w:r>
-    </w:p>
-    <w:p>
-      <w:pPr>
-        <w:jc w:val="both"/>
-        <w:rPr>
-          <w:rFonts w:ascii="Times New Roman" w:hAnsi="Times New Roman" w:cs="Times New Roman"/>
-          <w:sz w:val="26"/>
-          <w:szCs w:val="26"/>
-        </w:rPr>
-      </w:pPr>
-      <w:r>
-        <w:rPr>
-          <w:rFonts w:ascii="Times New Roman" w:hAnsi="Times New Roman" w:cs="Times New Roman"/>
-          <w:sz w:val="26"/>
-          <w:szCs w:val="26"/>
-        </w:rPr>
-        <w:t xml:space="preserve">Xác minh lỗi: Kiểm tra log Backend, Network tab, hoặc Postman response để xác định nguyên nhân. </w:t>
-      </w:r>
-    </w:p>
-    <w:p>
-      <w:pPr>
-        <w:jc w:val="both"/>
-        <w:rPr>
-          <w:rFonts w:ascii="Times New Roman" w:hAnsi="Times New Roman" w:cs="Times New Roman"/>
-          <w:sz w:val="26"/>
-          <w:szCs w:val="26"/>
-        </w:rPr>
-      </w:pPr>
-      <w:r>
-        <w:rPr>
-          <w:rFonts w:ascii="Times New Roman" w:hAnsi="Times New Roman" w:cs="Times New Roman"/>
-          <w:sz w:val="26"/>
-          <w:szCs w:val="26"/>
-        </w:rPr>
-        <w:t xml:space="preserve">Ghi nhận (Log Bug): Tạo Bug Ticket trên Jira / điền vào Bug_Report.xlsx kèm đầy đủ ảnh chụp, Response Body và đề xuất hướng xử lý. </w:t>
-      </w:r>
-    </w:p>
-    <w:p>
-      <w:pPr>
-        <w:jc w:val="both"/>
-        <w:rPr>
-          <w:rFonts w:ascii="Times New Roman" w:hAnsi="Times New Roman" w:cs="Times New Roman"/>
-          <w:sz w:val="26"/>
-          <w:szCs w:val="26"/>
-        </w:rPr>
-      </w:pPr>
-      <w:r>
-        <w:rPr>
-          <w:rFonts w:ascii="Times New Roman" w:hAnsi="Times New Roman" w:cs="Times New Roman"/>
-          <w:sz w:val="26"/>
-          <w:szCs w:val="26"/>
-        </w:rPr>
-        <w:t xml:space="preserve">Cập nhật trạng thái: Nếu lỗi không được fix do hạn chế nhân sự, ghi nhận trạng thái Known Issue phục vụ báo cáo nghiệm thu. </w:t>
-      </w:r>
-    </w:p>
-    <w:p>
-      <w:pPr>
-        <w:jc w:val="both"/>
-        <w:rPr>
-          <w:rFonts w:ascii="Times New Roman" w:hAnsi="Times New Roman" w:cs="Times New Roman"/>
-          <w:sz w:val="26"/>
-          <w:szCs w:val="26"/>
-        </w:rPr>
-      </w:pPr>
-    </w:p>
-    <w:p>
-      <w:pPr>
-        <w:pStyle w:val="Heading2"/>
-        <w:jc w:val="both"/>
-        <w:rPr>
-          <w:szCs w:val="26"/>
-        </w:rPr>
-      </w:pPr>
-      <w:bookmarkStart w:id="23" w:name="_Toc237628344"/>
-      <w:r>
-        <w:rPr>
-          <w:szCs w:val="26"/>
-        </w:rPr>
-        <w:t>7.1 Phân loại độ nghiêm trọng của lỗi (Severity Levels)</w:t>
-      </w:r>
-      <w:bookmarkEnd w:id="23"/>
-    </w:p>
-    <w:p>
-      <w:pPr>
-        <w:jc w:val="both"/>
-        <w:rPr>
-          <w:rFonts w:ascii="Times New Roman" w:hAnsi="Times New Roman" w:cs="Times New Roman"/>
-          <w:sz w:val="26"/>
-          <w:szCs w:val="26"/>
-        </w:rPr>
-      </w:pPr>
-      <w:r>
-        <w:rPr>
-          <w:rFonts w:ascii="Times New Roman" w:hAnsi="Times New Roman" w:cs="Times New Roman"/>
-          <w:sz w:val="26"/>
-          <w:szCs w:val="26"/>
-        </w:rPr>
-        <w:t xml:space="preserve">Blocker / Critical: Hệ thống sập, nổ lỗi 500 không bắt được exception, không thể đăng nhập, không thể checkout. </w:t>
-      </w:r>
-    </w:p>
-    <w:p>
-      <w:pPr>
-        <w:jc w:val="both"/>
-        <w:rPr>
-          <w:rFonts w:ascii="Times New Roman" w:hAnsi="Times New Roman" w:cs="Times New Roman"/>
-          <w:sz w:val="26"/>
-          <w:szCs w:val="26"/>
-        </w:rPr>
-      </w:pPr>
-      <w:r>
-        <w:rPr>
-          <w:rFonts w:ascii="Times New Roman" w:hAnsi="Times New Roman" w:cs="Times New Roman"/>
-          <w:sz w:val="26"/>
-          <w:szCs w:val="26"/>
-        </w:rPr>
-        <w:t xml:space="preserve">Major: Tính năng sai logic nghiệp vụ (ví dụ: hủy đơn nhưng không hoàn tồn kho, giá sản phẩm bị sai). </w:t>
-      </w:r>
-    </w:p>
-    <w:p>
-      <w:pPr>
-        <w:jc w:val="both"/>
-        <w:rPr>
-          <w:rFonts w:ascii="Times New Roman" w:hAnsi="Times New Roman" w:cs="Times New Roman"/>
-          <w:sz w:val="26"/>
-          <w:szCs w:val="26"/>
-        </w:rPr>
-      </w:pPr>
-      <w:r>
-        <w:rPr>
-          <w:rFonts w:ascii="Times New Roman" w:hAnsi="Times New Roman" w:cs="Times New Roman"/>
-          <w:sz w:val="26"/>
-          <w:szCs w:val="26"/>
-        </w:rPr>
-        <w:t xml:space="preserve">Medium: Lỗi phân quyền nhẹ, lỗi hiển thị thông báo không rõ ràng trên FE, thiếu validate form. </w:t>
-      </w:r>
-    </w:p>
-    <w:p>
-      <w:pPr>
-        <w:jc w:val="both"/>
-        <w:rPr>
-          <w:rFonts w:ascii="Times New Roman" w:hAnsi="Times New Roman" w:cs="Times New Roman"/>
-          <w:sz w:val="26"/>
-          <w:szCs w:val="26"/>
-        </w:rPr>
-      </w:pPr>
-      <w:r>
-        <w:rPr>
-          <w:rFonts w:ascii="Times New Roman" w:hAnsi="Times New Roman" w:cs="Times New Roman"/>
-          <w:sz w:val="26"/>
-          <w:szCs w:val="26"/>
-        </w:rPr>
-        <w:t xml:space="preserve">Low: Lỗi giao diện, lệch font, sai lỗi chính tả. </w:t>
-      </w:r>
-    </w:p>
-    <w:p>
-      <w:pPr>
-        <w:jc w:val="both"/>
-        <w:rPr>
-          <w:rFonts w:ascii="Times New Roman" w:hAnsi="Times New Roman" w:cs="Times New Roman"/>
-          <w:sz w:val="26"/>
-          <w:szCs w:val="26"/>
-        </w:rPr>
-      </w:pPr>
-    </w:p>
-    <w:p>
-      <w:pPr>
-        <w:pStyle w:val="Heading1"/>
-        <w:jc w:val="both"/>
-        <w:rPr>
-          <w:szCs w:val="26"/>
-        </w:rPr>
-      </w:pPr>
-      <w:bookmarkStart w:id="24" w:name="_Toc237628345"/>
+      <w:bookmarkStart w:id="24" w:name="_Toc238059529"/>
       <w:r>
         <w:rPr>
           <w:szCs w:val="26"/>
@@ -6973,7 +7366,6 @@
                 <w:sz w:val="26"/>
                 <w:szCs w:val="26"/>
               </w:rPr>
-              <w:lastRenderedPageBreak/>
               <w:t>1</w:t>
             </w:r>
           </w:p>
@@ -8693,7 +9085,7 @@
 </file>
 
 <file path=customXml/itemProps1.xml><?xml version="1.0" encoding="utf-8"?>
-<ds:datastoreItem xmlns:ds="http://schemas.openxmlformats.org/officeDocument/2006/customXml" ds:itemID="{F7B7329F-9333-4CFF-9E5B-D00440E99EF8}">
+<ds:datastoreItem xmlns:ds="http://schemas.openxmlformats.org/officeDocument/2006/customXml" ds:itemID="{AAF29482-15A1-4BE6-8940-60C9481E8B35}">
   <ds:schemaRefs>
     <ds:schemaRef ds:uri="http://schemas.openxmlformats.org/officeDocument/2006/bibliography"/>
   </ds:schemaRefs>

</xml_diff>